<commit_message>
Currency: live daily rates + relative "time ago" status; Instagram icon link; drop weather API
- Replace Instagram text link with an icon button matching the Italy site's tiktok/tripadvisor buttons
- Show rate freshness as a Hebrew relative time (updated every minute) instead of an absolute timestamp
- Update docx trip plan

Co-Authored-By: Claude Opus 4.8 <noreply@anthropic.com>
</commit_message>
<xml_diff>
--- a/תכנית לתאילנד.docx
+++ b/תכנית לתאילנד.docx
@@ -4,7 +4,7 @@
   <w:body>
     <w:tbl>
       <w:tblPr>
-        <w:tblStyle w:val="TableGrid"/>
+        <w:tblStyle w:val="ae"/>
         <w:bidiVisual/>
         <w:tblW w:w="12985" w:type="dxa"/>
         <w:tblLook w:val="04A0" w:firstRow="1" w:lastRow="0" w:firstColumn="1" w:lastColumn="0" w:noHBand="0" w:noVBand="1"/>
@@ -1774,35 +1774,7 @@
         <w:rPr>
           <w:rFonts w:ascii="Calibri" w:hAnsi="Calibri" w:cs="Calibri"/>
         </w:rPr>
-        <w:t xml:space="preserve">The </w:t>
-      </w:r>
-      <w:proofErr w:type="spellStart"/>
-      <w:r>
-        <w:rPr>
-          <w:rFonts w:ascii="Calibri" w:hAnsi="Calibri" w:cs="Calibri"/>
-        </w:rPr>
-        <w:t>mandison</w:t>
-      </w:r>
-      <w:proofErr w:type="spellEnd"/>
-      <w:r>
-        <w:rPr>
-          <w:rFonts w:ascii="Calibri" w:hAnsi="Calibri" w:cs="Calibri"/>
-        </w:rPr>
-        <w:t xml:space="preserve"> Bangkok - Formerly Golden Tulip </w:t>
-      </w:r>
-      <w:proofErr w:type="spellStart"/>
-      <w:r>
-        <w:rPr>
-          <w:rFonts w:ascii="Calibri" w:hAnsi="Calibri" w:cs="Calibri"/>
-        </w:rPr>
-        <w:t>Mandison</w:t>
-      </w:r>
-      <w:proofErr w:type="spellEnd"/>
-      <w:r>
-        <w:rPr>
-          <w:rFonts w:ascii="Calibri" w:hAnsi="Calibri" w:cs="Calibri"/>
-        </w:rPr>
-        <w:t xml:space="preserve"> Suites</w:t>
+        <w:t>The mandison Bangkok - Formerly Golden Tulip Mandison Suites</w:t>
       </w:r>
       <w:r>
         <w:rPr>
@@ -2033,19 +2005,11 @@
         </w:rPr>
         <w:t xml:space="preserve">הונג קונג- 1381 </w:t>
       </w:r>
-      <w:proofErr w:type="spellStart"/>
-      <w:r>
-        <w:rPr>
-          <w:rFonts w:ascii="Calibri" w:hAnsi="Calibri" w:cs="Calibri"/>
-        </w:rPr>
-        <w:t>Urbanwood</w:t>
-      </w:r>
-      <w:proofErr w:type="spellEnd"/>
-      <w:r>
-        <w:rPr>
-          <w:rFonts w:ascii="Calibri" w:hAnsi="Calibri" w:cs="Calibri"/>
-        </w:rPr>
-        <w:t xml:space="preserve"> Ap Lei Chau </w:t>
+      <w:r>
+        <w:rPr>
+          <w:rFonts w:ascii="Calibri" w:hAnsi="Calibri" w:cs="Calibri"/>
+        </w:rPr>
+        <w:t xml:space="preserve">Urbanwood Ap Lei Chau </w:t>
       </w:r>
       <w:hyperlink r:id="rId11" w:history="1">
         <w:r>
@@ -2266,15 +2230,24 @@
       <w:pPr>
         <w:bidi/>
         <w:rPr>
-          <w:rFonts w:ascii="Calibri" w:hAnsi="Calibri" w:cs="Calibri" w:hint="cs"/>
-          <w:rtl/>
-          <w:lang w:val="en-US"/>
-        </w:rPr>
-      </w:pPr>
+          <w:rFonts w:ascii="Calibri" w:hAnsi="Calibri" w:cs="Calibri"/>
+          <w:rtl/>
+          <w:lang w:val="en-US"/>
+        </w:rPr>
+      </w:pPr>
+      <w:r>
+        <w:rPr>
+          <w:rFonts w:ascii="Calibri" w:hAnsi="Calibri" w:cs="Calibri" w:hint="cs"/>
+          <w:rtl/>
+          <w:lang w:val="en-US"/>
+        </w:rPr>
+        <w:lastRenderedPageBreak/>
+        <w:t xml:space="preserve">מקומות נבחרים באיים </w:t>
+      </w:r>
     </w:p>
     <w:tbl>
       <w:tblPr>
-        <w:tblStyle w:val="TableGrid"/>
+        <w:tblStyle w:val="ae"/>
         <w:bidiVisual/>
         <w:tblW w:w="16287" w:type="dxa"/>
         <w:tblInd w:w="-1336" w:type="dxa"/>
@@ -2321,22 +2294,43 @@
             <w:pPr>
               <w:bidi/>
               <w:rPr>
+                <w:rFonts w:ascii="Calibri" w:hAnsi="Calibri" w:cs="Calibri"/>
+                <w:rtl/>
+              </w:rPr>
+            </w:pPr>
+            <w:r>
+              <w:rPr>
                 <w:rFonts w:ascii="Calibri" w:hAnsi="Calibri" w:cs="Calibri" w:hint="cs"/>
                 <w:rtl/>
               </w:rPr>
+              <w:t xml:space="preserve">שוק יום/לילה </w:t>
+            </w:r>
+          </w:p>
+        </w:tc>
+        <w:tc>
+          <w:tcPr>
+            <w:tcW w:w="4252" w:type="dxa"/>
+          </w:tcPr>
+          <w:p>
+            <w:pPr>
+              <w:bidi/>
+              <w:rPr>
+                <w:rFonts w:ascii="Calibri" w:hAnsi="Calibri" w:cs="Calibri"/>
+                <w:rtl/>
+              </w:rPr>
             </w:pPr>
             <w:r>
               <w:rPr>
                 <w:rFonts w:ascii="Calibri" w:hAnsi="Calibri" w:cs="Calibri" w:hint="cs"/>
                 <w:rtl/>
               </w:rPr>
-              <w:t xml:space="preserve">שוק יום/לילה </w:t>
-            </w:r>
-          </w:p>
-        </w:tc>
-        <w:tc>
-          <w:tcPr>
-            <w:tcW w:w="4252" w:type="dxa"/>
+              <w:t xml:space="preserve">אוכל </w:t>
+            </w:r>
+          </w:p>
+        </w:tc>
+        <w:tc>
+          <w:tcPr>
+            <w:tcW w:w="4816" w:type="dxa"/>
           </w:tcPr>
           <w:p>
             <w:pPr>
@@ -2351,13 +2345,13 @@
                 <w:rFonts w:ascii="Calibri" w:hAnsi="Calibri" w:cs="Calibri" w:hint="cs"/>
                 <w:rtl/>
               </w:rPr>
-              <w:t xml:space="preserve">אוכל </w:t>
-            </w:r>
-          </w:p>
-        </w:tc>
-        <w:tc>
-          <w:tcPr>
-            <w:tcW w:w="4816" w:type="dxa"/>
+              <w:t xml:space="preserve">קניות </w:t>
+            </w:r>
+          </w:p>
+        </w:tc>
+        <w:tc>
+          <w:tcPr>
+            <w:tcW w:w="2269" w:type="dxa"/>
           </w:tcPr>
           <w:p>
             <w:pPr>
@@ -2372,230 +2366,8 @@
                 <w:rFonts w:ascii="Calibri" w:hAnsi="Calibri" w:cs="Calibri" w:hint="cs"/>
                 <w:rtl/>
               </w:rPr>
-              <w:t xml:space="preserve">קניות </w:t>
-            </w:r>
-          </w:p>
-        </w:tc>
-        <w:tc>
-          <w:tcPr>
-            <w:tcW w:w="2269" w:type="dxa"/>
-          </w:tcPr>
-          <w:p>
-            <w:pPr>
-              <w:bidi/>
-              <w:rPr>
-                <w:rFonts w:ascii="Calibri" w:hAnsi="Calibri" w:cs="Calibri"/>
-                <w:rtl/>
-              </w:rPr>
-            </w:pPr>
-            <w:r>
-              <w:rPr>
-                <w:rFonts w:ascii="Calibri" w:hAnsi="Calibri" w:cs="Calibri" w:hint="cs"/>
-                <w:rtl/>
-              </w:rPr>
               <w:t xml:space="preserve">אטקרציות </w:t>
             </w:r>
-          </w:p>
-        </w:tc>
-      </w:tr>
-      <w:tr>
-        <w:trPr>
-          <w:trHeight w:val="2297"/>
-        </w:trPr>
-        <w:tc>
-          <w:tcPr>
-            <w:tcW w:w="835" w:type="dxa"/>
-          </w:tcPr>
-          <w:p>
-            <w:pPr>
-              <w:bidi/>
-              <w:rPr>
-                <w:rFonts w:ascii="Calibri" w:hAnsi="Calibri" w:cs="Calibri"/>
-                <w:rtl/>
-              </w:rPr>
-            </w:pPr>
-            <w:r>
-              <w:rPr>
-                <w:rFonts w:ascii="Calibri" w:hAnsi="Calibri" w:cs="Calibri" w:hint="cs"/>
-                <w:rtl/>
-              </w:rPr>
-              <w:t xml:space="preserve">בנגקוק </w:t>
-            </w:r>
-          </w:p>
-        </w:tc>
-        <w:tc>
-          <w:tcPr>
-            <w:tcW w:w="4115" w:type="dxa"/>
-          </w:tcPr>
-          <w:p>
-            <w:pPr>
-              <w:bidi/>
-              <w:rPr>
-                <w:rFonts w:ascii="Calibri" w:hAnsi="Calibri" w:cs="Calibri"/>
-                <w:rtl/>
-              </w:rPr>
-            </w:pPr>
-            <w:r>
-              <w:rPr>
-                <w:rFonts w:ascii="Calibri" w:hAnsi="Calibri" w:cs="Calibri"/>
-              </w:rPr>
-              <w:t>Chatuchak Weekend Market</w:t>
-            </w:r>
-            <w:r>
-              <w:rPr>
-                <w:rFonts w:ascii="Calibri" w:hAnsi="Calibri" w:cs="Calibri" w:hint="cs"/>
-                <w:rtl/>
-              </w:rPr>
-              <w:t xml:space="preserve"> </w:t>
-            </w:r>
-            <w:hyperlink r:id="rId13" w:history="1">
-              <w:r>
-                <w:rPr>
-                  <w:rStyle w:val="Hyperlink"/>
-                  <w:rFonts w:ascii="Calibri" w:hAnsi="Calibri" w:cs="Calibri"/>
-                </w:rPr>
-                <w:t>https://maps.app.goo.gl/XSJJ9aEvTMkmiRU96</w:t>
-              </w:r>
-            </w:hyperlink>
-          </w:p>
-        </w:tc>
-        <w:tc>
-          <w:tcPr>
-            <w:tcW w:w="4252" w:type="dxa"/>
-          </w:tcPr>
-          <w:p>
-            <w:pPr>
-              <w:bidi/>
-              <w:rPr>
-                <w:rFonts w:ascii="Calibri" w:hAnsi="Calibri" w:cs="Calibri"/>
-                <w:rtl/>
-              </w:rPr>
-            </w:pPr>
-            <w:hyperlink r:id="rId14" w:history="1">
-              <w:r>
-                <w:rPr>
-                  <w:rStyle w:val="Hyperlink"/>
-                  <w:rFonts w:ascii="Calibri" w:hAnsi="Calibri" w:cs="Calibri"/>
-                </w:rPr>
-                <w:t>https://vt.tiktok.com/ZS4bm32LU</w:t>
-              </w:r>
-              <w:r>
-                <w:rPr>
-                  <w:rStyle w:val="Hyperlink"/>
-                  <w:rFonts w:ascii="Calibri" w:hAnsi="Calibri" w:cs="Calibri"/>
-                  <w:rtl/>
-                </w:rPr>
-                <w:t>/</w:t>
-              </w:r>
-            </w:hyperlink>
-            <w:r>
-              <w:rPr>
-                <w:rFonts w:ascii="Calibri" w:hAnsi="Calibri" w:cs="Calibri" w:hint="cs"/>
-                <w:rtl/>
-              </w:rPr>
-              <w:t xml:space="preserve"> </w:t>
-            </w:r>
-          </w:p>
-          <w:p>
-            <w:pPr>
-              <w:bidi/>
-              <w:rPr>
-                <w:rFonts w:ascii="Calibri" w:hAnsi="Calibri" w:cs="Calibri"/>
-                <w:rtl/>
-              </w:rPr>
-            </w:pPr>
-            <w:r>
-              <w:rPr>
-                <w:rFonts w:ascii="Calibri" w:hAnsi="Calibri" w:cs="Calibri" w:hint="cs"/>
-                <w:rtl/>
-              </w:rPr>
-              <w:t xml:space="preserve">הנד רול </w:t>
-            </w:r>
-          </w:p>
-          <w:p>
-            <w:pPr>
-              <w:bidi/>
-              <w:rPr>
-                <w:rFonts w:ascii="Calibri" w:hAnsi="Calibri" w:cs="Calibri"/>
-                <w:rtl/>
-              </w:rPr>
-            </w:pPr>
-          </w:p>
-          <w:p>
-            <w:pPr>
-              <w:bidi/>
-              <w:rPr>
-                <w:rFonts w:ascii="Calibri" w:hAnsi="Calibri" w:cs="Calibri"/>
-                <w:rtl/>
-              </w:rPr>
-            </w:pPr>
-          </w:p>
-        </w:tc>
-        <w:tc>
-          <w:tcPr>
-            <w:tcW w:w="4816" w:type="dxa"/>
-          </w:tcPr>
-          <w:p>
-            <w:pPr>
-              <w:bidi/>
-              <w:rPr>
-                <w:rFonts w:ascii="Calibri" w:hAnsi="Calibri" w:cs="Calibri" w:hint="cs"/>
-                <w:rtl/>
-              </w:rPr>
-            </w:pPr>
-            <w:hyperlink r:id="rId15" w:history="1">
-              <w:r>
-                <w:rPr>
-                  <w:rStyle w:val="Hyperlink"/>
-                  <w:rFonts w:ascii="Calibri" w:hAnsi="Calibri" w:cs="Calibri"/>
-                </w:rPr>
-                <w:t>https://vt.tiktok.com/ZSHQKPH88</w:t>
-              </w:r>
-              <w:r>
-                <w:rPr>
-                  <w:rStyle w:val="Hyperlink"/>
-                  <w:rFonts w:ascii="Calibri" w:hAnsi="Calibri" w:cs="Calibri"/>
-                  <w:rtl/>
-                </w:rPr>
-                <w:t>/</w:t>
-              </w:r>
-            </w:hyperlink>
-            <w:r>
-              <w:rPr>
-                <w:rFonts w:ascii="Calibri" w:hAnsi="Calibri" w:cs="Calibri"/>
-              </w:rPr>
-              <w:t xml:space="preserve">  </w:t>
-            </w:r>
-            <w:r>
-              <w:rPr>
-                <w:rFonts w:ascii="Calibri" w:hAnsi="Calibri" w:cs="Calibri" w:hint="cs"/>
-                <w:rtl/>
-              </w:rPr>
-              <w:t xml:space="preserve">הסבר להגיע לחנות של הגינסים בתפירה אישית </w:t>
-            </w:r>
-          </w:p>
-          <w:p>
-            <w:pPr>
-              <w:bidi/>
-              <w:rPr>
-                <w:rFonts w:ascii="Calibri" w:hAnsi="Calibri" w:cs="Calibri"/>
-                <w:rtl/>
-              </w:rPr>
-            </w:pPr>
-          </w:p>
-        </w:tc>
-        <w:tc>
-          <w:tcPr>
-            <w:tcW w:w="2269" w:type="dxa"/>
-          </w:tcPr>
-          <w:p>
-            <w:pPr>
-              <w:bidi/>
-              <w:rPr>
-                <w:rFonts w:ascii="Calibri" w:hAnsi="Calibri" w:cs="Calibri"/>
-                <w:rtl/>
-              </w:rPr>
-            </w:pPr>
           </w:p>
         </w:tc>
       </w:tr>
@@ -2650,7 +2422,7 @@
                 <w:rtl/>
               </w:rPr>
             </w:pPr>
-            <w:hyperlink r:id="rId16" w:history="1">
+            <w:hyperlink r:id="rId13" w:history="1">
               <w:r>
                 <w:rPr>
                   <w:rStyle w:val="Hyperlink"/>
@@ -2814,16 +2586,16 @@
             <w:pPr>
               <w:bidi/>
               <w:rPr>
+                <w:rFonts w:ascii="Calibri" w:hAnsi="Calibri" w:cs="Calibri"/>
+                <w:lang w:val="en-US"/>
+              </w:rPr>
+            </w:pPr>
+            <w:r>
+              <w:rPr>
                 <w:rFonts w:ascii="Calibri" w:hAnsi="Calibri" w:cs="Calibri" w:hint="cs"/>
+                <w:rtl/>
                 <w:lang w:val="en-US"/>
               </w:rPr>
-            </w:pPr>
-            <w:r>
-              <w:rPr>
-                <w:rFonts w:ascii="Calibri" w:hAnsi="Calibri" w:cs="Calibri" w:hint="cs"/>
-                <w:rtl/>
-                <w:lang w:val="en-US"/>
-              </w:rPr>
               <w:t xml:space="preserve">שוק לילה צאוונג </w:t>
             </w:r>
           </w:p>
@@ -2831,7 +2603,7 @@
             <w:pPr>
               <w:bidi/>
               <w:rPr>
-                <w:rFonts w:ascii="Calibri" w:hAnsi="Calibri" w:cs="Calibri" w:hint="cs"/>
+                <w:rFonts w:ascii="Calibri" w:hAnsi="Calibri" w:cs="Calibri"/>
                 <w:rtl/>
                 <w:lang w:val="en-US"/>
               </w:rPr>
@@ -2897,12 +2669,21 @@
                 <w:rtl/>
               </w:rPr>
             </w:pPr>
+            <w:proofErr w:type="spellStart"/>
             <w:r>
               <w:rPr>
                 <w:rFonts w:ascii="Calibri" w:hAnsi="Calibri" w:cs="Calibri" w:hint="cs"/>
                 <w:rtl/>
               </w:rPr>
-              <w:t xml:space="preserve">קופנגן </w:t>
+              <w:t>קופנגן</w:t>
+            </w:r>
+            <w:proofErr w:type="spellEnd"/>
+            <w:r>
+              <w:rPr>
+                <w:rFonts w:ascii="Calibri" w:hAnsi="Calibri" w:cs="Calibri" w:hint="cs"/>
+                <w:rtl/>
+              </w:rPr>
+              <w:t xml:space="preserve"> </w:t>
             </w:r>
           </w:p>
         </w:tc>
@@ -2917,253 +2698,6 @@
                 <w:rFonts w:ascii="Calibri" w:hAnsi="Calibri" w:cs="Calibri" w:hint="cs"/>
                 <w:rtl/>
                 <w:lang w:val="en-US"/>
-              </w:rPr>
-            </w:pPr>
-          </w:p>
-        </w:tc>
-        <w:tc>
-          <w:tcPr>
-            <w:tcW w:w="4252" w:type="dxa"/>
-          </w:tcPr>
-          <w:p>
-            <w:pPr>
-              <w:bidi/>
-              <w:rPr>
-                <w:rFonts w:ascii="Calibri" w:hAnsi="Calibri" w:cs="Calibri"/>
-                <w:rtl/>
-              </w:rPr>
-            </w:pPr>
-          </w:p>
-        </w:tc>
-        <w:tc>
-          <w:tcPr>
-            <w:tcW w:w="4816" w:type="dxa"/>
-          </w:tcPr>
-          <w:p>
-            <w:pPr>
-              <w:bidi/>
-              <w:rPr>
-                <w:rFonts w:ascii="Calibri" w:hAnsi="Calibri" w:cs="Calibri"/>
-                <w:rtl/>
-              </w:rPr>
-            </w:pPr>
-          </w:p>
-        </w:tc>
-        <w:tc>
-          <w:tcPr>
-            <w:tcW w:w="2269" w:type="dxa"/>
-          </w:tcPr>
-          <w:p>
-            <w:pPr>
-              <w:bidi/>
-              <w:rPr>
-                <w:rFonts w:ascii="Calibri" w:hAnsi="Calibri" w:cs="Calibri"/>
-                <w:rtl/>
-              </w:rPr>
-            </w:pPr>
-          </w:p>
-        </w:tc>
-      </w:tr>
-      <w:tr>
-        <w:trPr>
-          <w:trHeight w:val="1147"/>
-        </w:trPr>
-        <w:tc>
-          <w:tcPr>
-            <w:tcW w:w="835" w:type="dxa"/>
-          </w:tcPr>
-          <w:p>
-            <w:pPr>
-              <w:bidi/>
-              <w:rPr>
-                <w:rFonts w:ascii="Calibri" w:hAnsi="Calibri" w:cs="Calibri"/>
-                <w:rtl/>
-              </w:rPr>
-            </w:pPr>
-            <w:r>
-              <w:rPr>
-                <w:rFonts w:ascii="Calibri" w:hAnsi="Calibri" w:cs="Calibri" w:hint="cs"/>
-                <w:rtl/>
-              </w:rPr>
-              <w:t xml:space="preserve">צאינג מאי </w:t>
-            </w:r>
-          </w:p>
-        </w:tc>
-        <w:tc>
-          <w:tcPr>
-            <w:tcW w:w="4115" w:type="dxa"/>
-          </w:tcPr>
-          <w:p>
-            <w:pPr>
-              <w:bidi/>
-              <w:rPr>
-                <w:rFonts w:ascii="Calibri" w:hAnsi="Calibri" w:cs="Calibri"/>
-                <w:rtl/>
-              </w:rPr>
-            </w:pPr>
-          </w:p>
-        </w:tc>
-        <w:tc>
-          <w:tcPr>
-            <w:tcW w:w="4252" w:type="dxa"/>
-          </w:tcPr>
-          <w:p>
-            <w:pPr>
-              <w:bidi/>
-              <w:rPr>
-                <w:rFonts w:ascii="Calibri" w:hAnsi="Calibri" w:cs="Calibri"/>
-                <w:rtl/>
-              </w:rPr>
-            </w:pPr>
-          </w:p>
-        </w:tc>
-        <w:tc>
-          <w:tcPr>
-            <w:tcW w:w="4816" w:type="dxa"/>
-          </w:tcPr>
-          <w:p>
-            <w:pPr>
-              <w:bidi/>
-              <w:rPr>
-                <w:rFonts w:ascii="Calibri" w:hAnsi="Calibri" w:cs="Calibri"/>
-                <w:rtl/>
-              </w:rPr>
-            </w:pPr>
-          </w:p>
-        </w:tc>
-        <w:tc>
-          <w:tcPr>
-            <w:tcW w:w="2269" w:type="dxa"/>
-          </w:tcPr>
-          <w:p>
-            <w:pPr>
-              <w:bidi/>
-              <w:rPr>
-                <w:rFonts w:ascii="Calibri" w:hAnsi="Calibri" w:cs="Calibri"/>
-                <w:rtl/>
-              </w:rPr>
-            </w:pPr>
-          </w:p>
-        </w:tc>
-      </w:tr>
-      <w:tr>
-        <w:trPr>
-          <w:trHeight w:val="1147"/>
-        </w:trPr>
-        <w:tc>
-          <w:tcPr>
-            <w:tcW w:w="835" w:type="dxa"/>
-          </w:tcPr>
-          <w:p>
-            <w:pPr>
-              <w:bidi/>
-              <w:rPr>
-                <w:rFonts w:ascii="Calibri" w:hAnsi="Calibri" w:cs="Calibri"/>
-                <w:rtl/>
-              </w:rPr>
-            </w:pPr>
-            <w:r>
-              <w:rPr>
-                <w:rFonts w:ascii="Calibri" w:hAnsi="Calibri" w:cs="Calibri" w:hint="cs"/>
-                <w:rtl/>
-              </w:rPr>
-              <w:lastRenderedPageBreak/>
-              <w:t xml:space="preserve">הונג קונג </w:t>
-            </w:r>
-          </w:p>
-        </w:tc>
-        <w:tc>
-          <w:tcPr>
-            <w:tcW w:w="4115" w:type="dxa"/>
-          </w:tcPr>
-          <w:p>
-            <w:pPr>
-              <w:bidi/>
-              <w:rPr>
-                <w:rFonts w:ascii="Calibri" w:hAnsi="Calibri" w:cs="Calibri"/>
-                <w:rtl/>
-              </w:rPr>
-            </w:pPr>
-          </w:p>
-        </w:tc>
-        <w:tc>
-          <w:tcPr>
-            <w:tcW w:w="4252" w:type="dxa"/>
-          </w:tcPr>
-          <w:p>
-            <w:pPr>
-              <w:bidi/>
-              <w:rPr>
-                <w:rFonts w:ascii="Calibri" w:hAnsi="Calibri" w:cs="Calibri"/>
-                <w:rtl/>
-              </w:rPr>
-            </w:pPr>
-          </w:p>
-        </w:tc>
-        <w:tc>
-          <w:tcPr>
-            <w:tcW w:w="4816" w:type="dxa"/>
-          </w:tcPr>
-          <w:p>
-            <w:pPr>
-              <w:bidi/>
-              <w:rPr>
-                <w:rFonts w:ascii="Calibri" w:hAnsi="Calibri" w:cs="Calibri"/>
-                <w:rtl/>
-              </w:rPr>
-            </w:pPr>
-          </w:p>
-        </w:tc>
-        <w:tc>
-          <w:tcPr>
-            <w:tcW w:w="2269" w:type="dxa"/>
-          </w:tcPr>
-          <w:p>
-            <w:pPr>
-              <w:bidi/>
-              <w:rPr>
-                <w:rFonts w:ascii="Calibri" w:hAnsi="Calibri" w:cs="Calibri"/>
-                <w:rtl/>
-              </w:rPr>
-            </w:pPr>
-          </w:p>
-        </w:tc>
-      </w:tr>
-      <w:tr>
-        <w:trPr>
-          <w:trHeight w:val="559"/>
-        </w:trPr>
-        <w:tc>
-          <w:tcPr>
-            <w:tcW w:w="835" w:type="dxa"/>
-          </w:tcPr>
-          <w:p>
-            <w:pPr>
-              <w:bidi/>
-              <w:rPr>
-                <w:rFonts w:ascii="Calibri" w:hAnsi="Calibri" w:cs="Calibri" w:hint="cs"/>
-                <w:rtl/>
-              </w:rPr>
-            </w:pPr>
-            <w:r>
-              <w:rPr>
-                <w:rFonts w:ascii="Calibri" w:hAnsi="Calibri" w:cs="Calibri" w:hint="cs"/>
-                <w:rtl/>
-              </w:rPr>
-              <w:t xml:space="preserve">מקאו </w:t>
-            </w:r>
-          </w:p>
-        </w:tc>
-        <w:tc>
-          <w:tcPr>
-            <w:tcW w:w="4115" w:type="dxa"/>
-          </w:tcPr>
-          <w:p>
-            <w:pPr>
-              <w:bidi/>
-              <w:rPr>
-                <w:rFonts w:ascii="Calibri" w:hAnsi="Calibri" w:cs="Calibri"/>
-                <w:rtl/>
               </w:rPr>
             </w:pPr>
           </w:p>
@@ -3223,16 +2757,41 @@
             <w:pPr>
               <w:bidi/>
               <w:rPr>
+                <w:rFonts w:ascii="Calibri" w:hAnsi="Calibri" w:cs="Calibri"/>
+                <w:rtl/>
+              </w:rPr>
+            </w:pPr>
+            <w:proofErr w:type="spellStart"/>
+            <w:r>
+              <w:rPr>
                 <w:rFonts w:ascii="Calibri" w:hAnsi="Calibri" w:cs="Calibri" w:hint="cs"/>
                 <w:rtl/>
               </w:rPr>
-            </w:pPr>
+              <w:t>קאו</w:t>
+            </w:r>
+            <w:proofErr w:type="spellEnd"/>
             <w:r>
               <w:rPr>
                 <w:rFonts w:ascii="Calibri" w:hAnsi="Calibri" w:cs="Calibri" w:hint="cs"/>
                 <w:rtl/>
               </w:rPr>
-              <w:t xml:space="preserve">קאו לאק </w:t>
+              <w:t xml:space="preserve"> </w:t>
+            </w:r>
+            <w:proofErr w:type="spellStart"/>
+            <w:r>
+              <w:rPr>
+                <w:rFonts w:ascii="Calibri" w:hAnsi="Calibri" w:cs="Calibri" w:hint="cs"/>
+                <w:rtl/>
+              </w:rPr>
+              <w:t>לאק</w:t>
+            </w:r>
+            <w:proofErr w:type="spellEnd"/>
+            <w:r>
+              <w:rPr>
+                <w:rFonts w:ascii="Calibri" w:hAnsi="Calibri" w:cs="Calibri" w:hint="cs"/>
+                <w:rtl/>
+              </w:rPr>
+              <w:t xml:space="preserve"> </w:t>
             </w:r>
           </w:p>
         </w:tc>
@@ -3244,7 +2803,7 @@
             <w:pPr>
               <w:bidi/>
               <w:rPr>
-                <w:rFonts w:ascii="Calibri" w:hAnsi="Calibri" w:cs="Calibri" w:hint="cs"/>
+                <w:rFonts w:ascii="Calibri" w:hAnsi="Calibri" w:cs="Calibri"/>
                 <w:rtl/>
                 <w:lang w:val="en-US"/>
               </w:rPr>
@@ -3333,6 +2892,2854 @@
         <w:bidi/>
         <w:rPr>
           <w:rFonts w:ascii="Calibri" w:hAnsi="Calibri" w:cs="Calibri"/>
+          <w:rtl/>
+        </w:rPr>
+      </w:pPr>
+    </w:p>
+    <w:p>
+      <w:pPr>
+        <w:bidi/>
+        <w:rPr>
+          <w:rFonts w:ascii="Calibri" w:hAnsi="Calibri" w:cs="Calibri"/>
+          <w:rtl/>
+        </w:rPr>
+      </w:pPr>
+    </w:p>
+    <w:p>
+      <w:pPr>
+        <w:bidi/>
+        <w:rPr>
+          <w:rFonts w:ascii="Calibri" w:hAnsi="Calibri" w:cs="Calibri"/>
+          <w:rtl/>
+        </w:rPr>
+      </w:pPr>
+    </w:p>
+    <w:p>
+      <w:pPr>
+        <w:bidi/>
+        <w:rPr>
+          <w:rFonts w:ascii="Calibri" w:hAnsi="Calibri" w:cs="Calibri"/>
+          <w:rtl/>
+        </w:rPr>
+      </w:pPr>
+    </w:p>
+    <w:p>
+      <w:pPr>
+        <w:bidi/>
+        <w:rPr>
+          <w:rFonts w:ascii="Calibri" w:hAnsi="Calibri" w:cs="Calibri"/>
+          <w:rtl/>
+        </w:rPr>
+      </w:pPr>
+    </w:p>
+    <w:p>
+      <w:pPr>
+        <w:bidi/>
+        <w:rPr>
+          <w:rFonts w:ascii="Calibri" w:hAnsi="Calibri" w:cs="Calibri"/>
+          <w:rtl/>
+        </w:rPr>
+      </w:pPr>
+    </w:p>
+    <w:p>
+      <w:pPr>
+        <w:bidi/>
+        <w:rPr>
+          <w:rFonts w:ascii="Calibri" w:hAnsi="Calibri" w:cs="Calibri"/>
+          <w:b/>
+          <w:bCs/>
+          <w:rtl/>
+        </w:rPr>
+      </w:pPr>
+      <w:r>
+        <w:rPr>
+          <w:rFonts w:ascii="Calibri" w:hAnsi="Calibri" w:cs="Calibri" w:hint="cs"/>
+          <w:b/>
+          <w:bCs/>
+          <w:rtl/>
+        </w:rPr>
+        <w:t>מה עוד לשים באפליקציה:</w:t>
+      </w:r>
+    </w:p>
+    <w:p>
+      <w:pPr>
+        <w:bidi/>
+        <w:rPr>
+          <w:rFonts w:ascii="Calibri" w:hAnsi="Calibri" w:cs="Calibri"/>
+          <w:rtl/>
+          <w:lang w:val="en-US"/>
+        </w:rPr>
+      </w:pPr>
+      <w:r>
+        <w:rPr>
+          <w:rFonts w:ascii="Calibri" w:hAnsi="Calibri" w:cs="Calibri"/>
+        </w:rPr>
+        <w:t xml:space="preserve">Wishlist </w:t>
+      </w:r>
+      <w:r>
+        <w:rPr>
+          <w:rFonts w:ascii="Calibri" w:hAnsi="Calibri" w:cs="Calibri"/>
+          <w:lang w:val="en-US"/>
+        </w:rPr>
+        <w:t xml:space="preserve"> </w:t>
+      </w:r>
+      <w:r>
+        <w:rPr>
+          <w:rFonts w:ascii="Calibri" w:hAnsi="Calibri" w:cs="Calibri" w:hint="cs"/>
+          <w:rtl/>
+          <w:lang w:val="en-US"/>
+        </w:rPr>
+        <w:t xml:space="preserve">קניות </w:t>
+      </w:r>
+    </w:p>
+    <w:p>
+      <w:pPr>
+        <w:bidi/>
+        <w:rPr>
+          <w:rFonts w:ascii="Calibri" w:hAnsi="Calibri" w:cs="Calibri"/>
+          <w:rtl/>
+          <w:lang w:val="en-US"/>
+        </w:rPr>
+      </w:pPr>
+      <w:r>
+        <w:rPr>
+          <w:rFonts w:ascii="Calibri" w:hAnsi="Calibri" w:cs="Calibri"/>
+        </w:rPr>
+        <w:t>Visited toggle</w:t>
+      </w:r>
+      <w:r>
+        <w:rPr>
+          <w:rFonts w:ascii="Calibri" w:hAnsi="Calibri" w:cs="Calibri" w:hint="cs"/>
+          <w:rtl/>
+          <w:lang w:val="en-US"/>
+        </w:rPr>
+        <w:t xml:space="preserve"> </w:t>
+      </w:r>
+      <w:r>
+        <w:rPr>
+          <w:rFonts w:ascii="Calibri" w:hAnsi="Calibri" w:cs="Calibri"/>
+          <w:rtl/>
+          <w:lang w:val="en-US"/>
+        </w:rPr>
+        <w:t>–</w:t>
+      </w:r>
+      <w:r>
+        <w:rPr>
+          <w:rFonts w:ascii="Calibri" w:hAnsi="Calibri" w:cs="Calibri" w:hint="cs"/>
+          <w:rtl/>
+          <w:lang w:val="en-US"/>
+        </w:rPr>
+        <w:t xml:space="preserve"> ביעדים שהם לא לגמרי מפורטים עם לוז לשים סימון לשים וי על מקום שביקרנו בו </w:t>
+      </w:r>
+    </w:p>
+    <w:p>
+      <w:pPr>
+        <w:bidi/>
+        <w:rPr>
+          <w:rFonts w:ascii="Calibri" w:hAnsi="Calibri" w:cs="Calibri"/>
+          <w:rtl/>
+          <w:lang w:val="en-US"/>
+        </w:rPr>
+      </w:pPr>
+      <w:r>
+        <w:rPr>
+          <w:rFonts w:ascii="Calibri" w:hAnsi="Calibri" w:cs="Calibri"/>
+        </w:rPr>
+        <w:t>Currency quick convert</w:t>
+      </w:r>
+      <w:r>
+        <w:rPr>
+          <w:rFonts w:ascii="Calibri" w:hAnsi="Calibri" w:cs="Calibri" w:hint="cs"/>
+          <w:rtl/>
+          <w:lang w:val="en-US"/>
+        </w:rPr>
+        <w:t xml:space="preserve"> </w:t>
+      </w:r>
+      <w:r>
+        <w:rPr>
+          <w:rFonts w:ascii="Calibri" w:hAnsi="Calibri" w:cs="Calibri"/>
+          <w:rtl/>
+          <w:lang w:val="en-US"/>
+        </w:rPr>
+        <w:t>–</w:t>
+      </w:r>
+      <w:r>
+        <w:rPr>
+          <w:rFonts w:ascii="Calibri" w:hAnsi="Calibri" w:cs="Calibri" w:hint="cs"/>
+          <w:rtl/>
+          <w:lang w:val="en-US"/>
+        </w:rPr>
+        <w:t xml:space="preserve"> עם שקל, </w:t>
+      </w:r>
+      <w:proofErr w:type="spellStart"/>
+      <w:r>
+        <w:rPr>
+          <w:rFonts w:ascii="Calibri" w:hAnsi="Calibri" w:cs="Calibri" w:hint="cs"/>
+          <w:rtl/>
+          <w:lang w:val="en-US"/>
+        </w:rPr>
+        <w:t>באט</w:t>
+      </w:r>
+      <w:proofErr w:type="spellEnd"/>
+      <w:r>
+        <w:rPr>
+          <w:rFonts w:ascii="Calibri" w:hAnsi="Calibri" w:cs="Calibri" w:hint="cs"/>
+          <w:rtl/>
+          <w:lang w:val="en-US"/>
+        </w:rPr>
+        <w:t xml:space="preserve">, דולר אמריקאי, דולר הונג </w:t>
+      </w:r>
+      <w:proofErr w:type="spellStart"/>
+      <w:r>
+        <w:rPr>
+          <w:rFonts w:ascii="Calibri" w:hAnsi="Calibri" w:cs="Calibri" w:hint="cs"/>
+          <w:rtl/>
+          <w:lang w:val="en-US"/>
+        </w:rPr>
+        <w:t>קונגי</w:t>
+      </w:r>
+      <w:proofErr w:type="spellEnd"/>
+      <w:r>
+        <w:rPr>
+          <w:rFonts w:ascii="Calibri" w:hAnsi="Calibri" w:cs="Calibri" w:hint="cs"/>
+          <w:rtl/>
+          <w:lang w:val="en-US"/>
+        </w:rPr>
+        <w:t xml:space="preserve">, פנקה מקאו </w:t>
+      </w:r>
+    </w:p>
+    <w:p>
+      <w:pPr>
+        <w:bidi/>
+        <w:rPr>
+          <w:rFonts w:ascii="Calibri" w:hAnsi="Calibri" w:cs="Calibri"/>
+          <w:rtl/>
+        </w:rPr>
+      </w:pPr>
+    </w:p>
+    <w:p>
+      <w:pPr>
+        <w:bidi/>
+        <w:rPr>
+          <w:rFonts w:ascii="Calibri" w:hAnsi="Calibri" w:cs="Calibri"/>
+          <w:b/>
+          <w:bCs/>
+          <w:rtl/>
+        </w:rPr>
+      </w:pPr>
+      <w:r>
+        <w:rPr>
+          <w:rFonts w:ascii="Calibri" w:hAnsi="Calibri" w:cs="Calibri" w:hint="cs"/>
+          <w:b/>
+          <w:bCs/>
+          <w:rtl/>
+        </w:rPr>
+        <w:t xml:space="preserve">פירוט ביעדים נבחרים </w:t>
+      </w:r>
+    </w:p>
+    <w:p>
+      <w:pPr>
+        <w:bidi/>
+        <w:rPr>
+          <w:rFonts w:ascii="Calibri" w:hAnsi="Calibri" w:cs="Calibri"/>
+          <w:b/>
+          <w:bCs/>
+          <w:rtl/>
+        </w:rPr>
+      </w:pPr>
+      <w:r>
+        <w:rPr>
+          <w:rFonts w:ascii="Calibri" w:hAnsi="Calibri" w:cs="Calibri" w:hint="cs"/>
+          <w:b/>
+          <w:bCs/>
+          <w:rtl/>
+        </w:rPr>
+        <w:t xml:space="preserve">מסלול בנגקוק </w:t>
+      </w:r>
+    </w:p>
+    <w:p>
+      <w:pPr>
+        <w:bidi/>
+        <w:rPr>
+          <w:rFonts w:ascii="Calibri" w:hAnsi="Calibri" w:cs="Calibri"/>
+          <w:b/>
+          <w:bCs/>
+          <w:rtl/>
+        </w:rPr>
+      </w:pPr>
+      <w:r>
+        <w:rPr>
+          <w:rFonts w:ascii="Calibri" w:hAnsi="Calibri" w:cs="Calibri" w:hint="cs"/>
+          <w:b/>
+          <w:bCs/>
+          <w:rtl/>
+        </w:rPr>
+        <w:t xml:space="preserve">יום 1 </w:t>
+      </w:r>
+      <w:r>
+        <w:rPr>
+          <w:rFonts w:ascii="Calibri" w:hAnsi="Calibri" w:cs="Calibri"/>
+          <w:b/>
+          <w:bCs/>
+          <w:rtl/>
+        </w:rPr>
+        <w:t>–</w:t>
+      </w:r>
+      <w:r>
+        <w:rPr>
+          <w:rFonts w:ascii="Calibri" w:hAnsi="Calibri" w:cs="Calibri" w:hint="cs"/>
+          <w:b/>
+          <w:bCs/>
+          <w:rtl/>
+        </w:rPr>
+        <w:t xml:space="preserve"> 26.9 </w:t>
+      </w:r>
+      <w:r>
+        <w:rPr>
+          <w:rFonts w:ascii="Calibri" w:hAnsi="Calibri" w:cs="Calibri"/>
+          <w:b/>
+          <w:bCs/>
+          <w:rtl/>
+        </w:rPr>
+        <w:t>–</w:t>
+      </w:r>
+      <w:r>
+        <w:rPr>
+          <w:rFonts w:ascii="Calibri" w:hAnsi="Calibri" w:cs="Calibri" w:hint="cs"/>
+          <w:b/>
+          <w:bCs/>
+          <w:rtl/>
+        </w:rPr>
+        <w:t xml:space="preserve"> יום שבת </w:t>
+      </w:r>
+    </w:p>
+    <w:p>
+      <w:pPr>
+        <w:bidi/>
+        <w:rPr>
+          <w:rFonts w:ascii="Calibri" w:hAnsi="Calibri" w:cs="Calibri"/>
+          <w:rtl/>
+        </w:rPr>
+      </w:pPr>
+      <w:r>
+        <w:rPr>
+          <w:rFonts w:ascii="Calibri" w:hAnsi="Calibri" w:cs="Calibri" w:hint="cs"/>
+          <w:rtl/>
+          <w:lang w:val="en-US"/>
+        </w:rPr>
+        <w:t>ארוחת בוקר ב&gt;</w:t>
+      </w:r>
+      <w:hyperlink r:id="rId14" w:history="1">
+        <w:r>
+          <w:rPr>
+            <w:rStyle w:val="Hyperlink"/>
+            <w:rFonts w:ascii="Calibri" w:hAnsi="Calibri" w:cs="Calibri"/>
+            <w:rtl/>
+            <w:lang w:val="en-US"/>
+          </w:rPr>
+          <w:t xml:space="preserve"> </w:t>
+        </w:r>
+        <w:r>
+          <w:rPr>
+            <w:rStyle w:val="Hyperlink"/>
+            <w:rFonts w:ascii="Calibri" w:hAnsi="Calibri" w:cs="Calibri"/>
+          </w:rPr>
+          <w:t>Eggtisan by commonroom x ari</w:t>
+        </w:r>
+      </w:hyperlink>
+    </w:p>
+    <w:p>
+      <w:pPr>
+        <w:bidi/>
+        <w:rPr>
+          <w:rFonts w:ascii="Calibri" w:hAnsi="Calibri" w:cs="Calibri"/>
+          <w:rtl/>
+          <w:lang w:val="en-US"/>
+        </w:rPr>
+      </w:pPr>
+      <w:r>
+        <w:rPr>
+          <w:rFonts w:ascii="Calibri" w:hAnsi="Calibri" w:cs="Calibri" w:hint="cs"/>
+          <w:rtl/>
+        </w:rPr>
+        <w:t xml:space="preserve">סיבוב בשכונת </w:t>
+      </w:r>
+      <w:r>
+        <w:rPr>
+          <w:rFonts w:ascii="Calibri" w:hAnsi="Calibri" w:cs="Calibri"/>
+          <w:lang w:val="en-US"/>
+        </w:rPr>
+        <w:t xml:space="preserve">ARI </w:t>
+      </w:r>
+      <w:r>
+        <w:rPr>
+          <w:rFonts w:ascii="Calibri" w:hAnsi="Calibri" w:cs="Calibri" w:hint="cs"/>
+          <w:rtl/>
+          <w:lang w:val="en-US"/>
+        </w:rPr>
+        <w:t xml:space="preserve"> (כן כן)</w:t>
+      </w:r>
+      <w:r>
+        <w:rPr>
+          <w:rFonts w:ascii="Calibri" w:hAnsi="Calibri" w:cs="Calibri" w:hint="cs"/>
+          <w:rtl/>
+          <w:lang w:val="en-US"/>
+        </w:rPr>
+        <w:t xml:space="preserve">, לראות את הרחובות היפים, להיכנס לחנויות בוטיק נחמדות </w:t>
+      </w:r>
+    </w:p>
+    <w:p>
+      <w:pPr>
+        <w:bidi/>
+        <w:rPr>
+          <w:rFonts w:ascii="Calibri" w:hAnsi="Calibri" w:cs="Calibri"/>
+          <w:rtl/>
+          <w:lang w:val="en-US"/>
+        </w:rPr>
+      </w:pPr>
+      <w:r>
+        <w:rPr>
+          <w:rFonts w:ascii="Calibri" w:hAnsi="Calibri" w:cs="Calibri" w:hint="cs"/>
+          <w:rtl/>
+          <w:lang w:val="en-US"/>
+        </w:rPr>
+        <w:t xml:space="preserve">להיכנס ל&gt; </w:t>
+      </w:r>
+      <w:r>
+        <w:rPr>
+          <w:rFonts w:ascii="Calibri" w:hAnsi="Calibri" w:cs="Calibri" w:hint="cs"/>
+          <w:rtl/>
+        </w:rPr>
+        <w:t xml:space="preserve"> </w:t>
+      </w:r>
+      <w:hyperlink r:id="rId15" w:history="1">
+        <w:r>
+          <w:rPr>
+            <w:rStyle w:val="Hyperlink"/>
+            <w:rFonts w:ascii="Calibri" w:hAnsi="Calibri" w:cs="Calibri"/>
+          </w:rPr>
+          <w:t xml:space="preserve">GUMP’s </w:t>
+        </w:r>
+        <w:r>
+          <w:rPr>
+            <w:rStyle w:val="Hyperlink"/>
+            <w:rFonts w:ascii="Calibri" w:hAnsi="Calibri" w:cs="Calibri"/>
+          </w:rPr>
+          <w:t>Ari Community Space</w:t>
+        </w:r>
+      </w:hyperlink>
+    </w:p>
+    <w:p>
+      <w:pPr>
+        <w:bidi/>
+        <w:rPr>
+          <w:rFonts w:ascii="Calibri" w:hAnsi="Calibri" w:cs="Calibri"/>
+          <w:lang w:val="en-US"/>
+        </w:rPr>
+      </w:pPr>
+      <w:r>
+        <w:rPr>
+          <w:rFonts w:ascii="Calibri" w:hAnsi="Calibri" w:cs="Calibri" w:hint="cs"/>
+          <w:rtl/>
+          <w:lang w:val="en-US"/>
+        </w:rPr>
+        <w:t xml:space="preserve">חנויות בוטיק מעניינות בשכונה &gt; </w:t>
+      </w:r>
+      <w:r>
+        <w:rPr>
+          <w:rFonts w:ascii="Calibri" w:hAnsi="Calibri" w:cs="Calibri"/>
+        </w:rPr>
+        <w:t>HIDE.Selected</w:t>
+      </w:r>
+    </w:p>
+    <w:p>
+      <w:pPr>
+        <w:bidi/>
+        <w:rPr>
+          <w:rFonts w:ascii="Calibri" w:hAnsi="Calibri" w:cs="Calibri"/>
+          <w:rtl/>
+          <w:lang w:val="en-US"/>
+        </w:rPr>
+      </w:pPr>
+      <w:r>
+        <w:rPr>
+          <w:rFonts w:ascii="Calibri" w:hAnsi="Calibri" w:cs="Calibri"/>
+        </w:rPr>
+        <w:t>MADBACON</w:t>
+      </w:r>
+    </w:p>
+    <w:p>
+      <w:pPr>
+        <w:bidi/>
+        <w:rPr>
+          <w:rFonts w:ascii="Calibri" w:hAnsi="Calibri" w:cs="Calibri"/>
+          <w:rtl/>
+          <w:lang w:val="en-US"/>
+        </w:rPr>
+      </w:pPr>
+      <w:r>
+        <w:rPr>
+          <w:rFonts w:ascii="Calibri" w:hAnsi="Calibri" w:cs="Calibri"/>
+        </w:rPr>
+        <w:t>fumiikii tokyo</w:t>
+      </w:r>
+      <w:r>
+        <w:rPr>
+          <w:rFonts w:ascii="Calibri" w:hAnsi="Calibri" w:cs="Calibri" w:hint="cs"/>
+          <w:rtl/>
+          <w:lang w:val="en-US"/>
+        </w:rPr>
+        <w:t xml:space="preserve"> </w:t>
+      </w:r>
+    </w:p>
+    <w:p>
+      <w:pPr>
+        <w:bidi/>
+        <w:rPr>
+          <w:rFonts w:ascii="Calibri" w:hAnsi="Calibri" w:cs="Calibri"/>
+          <w:rtl/>
+          <w:lang w:val="en-US"/>
+        </w:rPr>
+      </w:pPr>
+      <w:r>
+        <w:rPr>
+          <w:rFonts w:ascii="Calibri" w:hAnsi="Calibri" w:cs="Calibri" w:hint="cs"/>
+          <w:rtl/>
+          <w:lang w:val="en-US"/>
+        </w:rPr>
+        <w:t xml:space="preserve">משם להמשיך את היום לשוק &gt; </w:t>
+      </w:r>
+      <w:r>
+        <w:rPr>
+          <w:rFonts w:ascii="Calibri" w:hAnsi="Calibri" w:cs="Calibri"/>
+        </w:rPr>
+        <w:t>Chatuchak</w:t>
+      </w:r>
+    </w:p>
+    <w:p>
+      <w:pPr>
+        <w:bidi/>
+        <w:rPr>
+          <w:rFonts w:ascii="Calibri" w:hAnsi="Calibri" w:cs="Calibri"/>
+          <w:rtl/>
+          <w:lang w:val="en-US"/>
+        </w:rPr>
+      </w:pPr>
+    </w:p>
+    <w:p>
+      <w:pPr>
+        <w:bidi/>
+        <w:rPr>
+          <w:rFonts w:ascii="Calibri" w:hAnsi="Calibri" w:cs="Calibri"/>
+          <w:rtl/>
+          <w:lang w:val="en-US"/>
+        </w:rPr>
+      </w:pPr>
+    </w:p>
+    <w:p>
+      <w:pPr>
+        <w:bidi/>
+        <w:rPr>
+          <w:rFonts w:ascii="Calibri" w:hAnsi="Calibri" w:cs="Calibri" w:hint="cs"/>
+          <w:b/>
+          <w:bCs/>
+          <w:rtl/>
+          <w:lang w:val="en-US"/>
+        </w:rPr>
+      </w:pPr>
+      <w:r>
+        <w:rPr>
+          <w:rFonts w:ascii="Calibri" w:hAnsi="Calibri" w:cs="Calibri" w:hint="cs"/>
+          <w:b/>
+          <w:bCs/>
+          <w:rtl/>
+          <w:lang w:val="en-US"/>
+        </w:rPr>
+        <w:lastRenderedPageBreak/>
+        <w:t xml:space="preserve">יום 2- 27.9- יום ראשון </w:t>
+      </w:r>
+    </w:p>
+    <w:p>
+      <w:pPr>
+        <w:bidi/>
+        <w:rPr>
+          <w:rFonts w:ascii="Calibri" w:hAnsi="Calibri" w:cs="Calibri" w:hint="cs"/>
+          <w:rtl/>
+          <w:lang w:val="en-US"/>
+        </w:rPr>
+      </w:pPr>
+      <w:r>
+        <w:rPr>
+          <w:rFonts w:ascii="Calibri" w:hAnsi="Calibri" w:cs="Calibri" w:hint="cs"/>
+          <w:rtl/>
+          <w:lang w:val="en-US"/>
+        </w:rPr>
+        <w:t xml:space="preserve">שכונת </w:t>
+      </w:r>
+      <w:proofErr w:type="spellStart"/>
+      <w:r>
+        <w:rPr>
+          <w:rFonts w:ascii="Calibri" w:hAnsi="Calibri" w:cs="Calibri" w:hint="cs"/>
+          <w:rtl/>
+          <w:lang w:val="en-US"/>
+        </w:rPr>
+        <w:t>סונג</w:t>
+      </w:r>
+      <w:proofErr w:type="spellEnd"/>
+      <w:r>
+        <w:rPr>
+          <w:rFonts w:ascii="Calibri" w:hAnsi="Calibri" w:cs="Calibri" w:hint="cs"/>
+          <w:rtl/>
+          <w:lang w:val="en-US"/>
+        </w:rPr>
+        <w:t xml:space="preserve"> וואט </w:t>
+      </w:r>
+    </w:p>
+    <w:p>
+      <w:pPr>
+        <w:bidi/>
+        <w:rPr>
+          <w:rFonts w:ascii="Calibri" w:hAnsi="Calibri" w:cs="Calibri" w:hint="cs"/>
+          <w:rtl/>
+          <w:lang w:val="en-US"/>
+        </w:rPr>
+      </w:pPr>
+      <w:r>
+        <w:rPr>
+          <w:rFonts w:ascii="Calibri" w:hAnsi="Calibri" w:cs="Calibri" w:hint="cs"/>
+          <w:rtl/>
+          <w:lang w:val="en-US"/>
+        </w:rPr>
+        <w:t xml:space="preserve">קפה ומאפה&gt; </w:t>
+      </w:r>
+      <w:r>
+        <w:rPr>
+          <w:rFonts w:ascii="Calibri" w:hAnsi="Calibri" w:cs="Calibri"/>
+          <w:b/>
+          <w:bCs/>
+        </w:rPr>
+        <w:t>LOCAL BOYS COFFEE CO. SONG WAT</w:t>
+      </w:r>
+      <w:r>
+        <w:rPr>
+          <w:rFonts w:ascii="Calibri" w:hAnsi="Calibri" w:cs="Calibri"/>
+        </w:rPr>
+        <w:t>.</w:t>
+      </w:r>
+      <w:r>
+        <w:rPr>
+          <w:rFonts w:ascii="Calibri" w:hAnsi="Calibri" w:cs="Calibri"/>
+          <w:lang w:val="en-US"/>
+        </w:rPr>
+        <w:t xml:space="preserve"> </w:t>
+      </w:r>
+      <w:r>
+        <w:rPr>
+          <w:rFonts w:ascii="Calibri" w:hAnsi="Calibri" w:cs="Calibri" w:hint="cs"/>
+          <w:rtl/>
+          <w:lang w:val="en-US"/>
+        </w:rPr>
+        <w:t xml:space="preserve"> או ב- </w:t>
+      </w:r>
+      <w:r>
+        <w:rPr>
+          <w:rFonts w:ascii="Calibri" w:hAnsi="Calibri" w:cs="Calibri"/>
+          <w:lang w:val="en-US"/>
+        </w:rPr>
+        <w:t>Song Wat Coffee Roasters</w:t>
+      </w:r>
+    </w:p>
+    <w:p>
+      <w:pPr>
+        <w:bidi/>
+        <w:rPr>
+          <w:rFonts w:ascii="Calibri" w:hAnsi="Calibri" w:cs="Calibri"/>
+          <w:rtl/>
+        </w:rPr>
+      </w:pPr>
+      <w:r>
+        <w:rPr>
+          <w:rFonts w:ascii="Calibri" w:hAnsi="Calibri" w:cs="Calibri"/>
+          <w:lang w:val="en-US"/>
+        </w:rPr>
+        <w:t xml:space="preserve"> </w:t>
+      </w:r>
+      <w:r>
+        <w:rPr>
+          <w:rFonts w:ascii="Calibri" w:hAnsi="Calibri" w:cs="Calibri"/>
+        </w:rPr>
+        <w:t xml:space="preserve">Song Wat </w:t>
+      </w:r>
+      <w:r>
+        <w:rPr>
+          <w:rFonts w:ascii="Calibri" w:hAnsi="Calibri" w:cs="Calibri"/>
+          <w:rtl/>
+          <w:lang w:val="en-US"/>
+        </w:rPr>
+        <w:t>הוא בערך קילומטר אחד של רחוב היסטורי שנבנה באזור מסחרי על הנהר, והיום עדיין יש בו</w:t>
+      </w:r>
+      <w:r>
+        <w:rPr>
+          <w:rFonts w:ascii="Calibri" w:hAnsi="Calibri" w:cs="Calibri"/>
+        </w:rPr>
+        <w:t xml:space="preserve"> wholesale shops </w:t>
+      </w:r>
+      <w:r>
+        <w:rPr>
+          <w:rFonts w:ascii="Calibri" w:hAnsi="Calibri" w:cs="Calibri"/>
+          <w:rtl/>
+          <w:lang w:val="en-US"/>
+        </w:rPr>
+        <w:t>ועסקים סיניים ישנים ממש ליד החנויות החדשות</w:t>
+      </w:r>
+      <w:r>
+        <w:rPr>
+          <w:rFonts w:ascii="Calibri" w:hAnsi="Calibri" w:cs="Calibri"/>
+        </w:rPr>
+        <w:t>.</w:t>
+      </w:r>
+    </w:p>
+    <w:p>
+      <w:pPr>
+        <w:bidi/>
+        <w:rPr>
+          <w:rFonts w:ascii="Calibri" w:hAnsi="Calibri" w:cs="Calibri" w:hint="cs"/>
+          <w:rtl/>
+          <w:lang w:val="en-US"/>
+        </w:rPr>
+      </w:pPr>
+      <w:r>
+        <w:rPr>
+          <w:rFonts w:ascii="Calibri" w:hAnsi="Calibri" w:cs="Calibri" w:hint="cs"/>
+          <w:rtl/>
+          <w:lang w:val="en-US"/>
+        </w:rPr>
+        <w:t>חנויות להיות בהן:</w:t>
+      </w:r>
+    </w:p>
+    <w:p>
+      <w:pPr>
+        <w:bidi/>
+        <w:rPr>
+          <w:rFonts w:ascii="Calibri" w:hAnsi="Calibri" w:cs="Calibri"/>
+          <w:lang w:val="en-US"/>
+        </w:rPr>
+      </w:pPr>
+      <w:r>
+        <w:rPr>
+          <w:rFonts w:ascii="Calibri" w:hAnsi="Calibri" w:cs="Calibri" w:hint="cs"/>
+          <w:rtl/>
+          <w:lang w:val="en-US"/>
+        </w:rPr>
+        <w:t xml:space="preserve">קרמיקות מגניבות- </w:t>
+      </w:r>
+      <w:r>
+        <w:rPr>
+          <w:rFonts w:ascii="Calibri" w:hAnsi="Calibri" w:cs="Calibri"/>
+          <w:lang w:val="en-US"/>
+        </w:rPr>
+        <w:t xml:space="preserve">CLAY CIRCLE </w:t>
+      </w:r>
+      <w:r>
+        <w:rPr>
+          <w:rFonts w:ascii="Calibri" w:hAnsi="Calibri" w:cs="Calibri" w:hint="cs"/>
+          <w:rtl/>
+          <w:lang w:val="en-US"/>
+        </w:rPr>
+        <w:t xml:space="preserve">  \ </w:t>
+      </w:r>
+      <w:r>
+        <w:rPr>
+          <w:rFonts w:ascii="Calibri" w:hAnsi="Calibri" w:cs="Calibri"/>
+          <w:lang w:val="en-US"/>
+        </w:rPr>
+        <w:t xml:space="preserve">OYSTER &amp; THINGS  </w:t>
+      </w:r>
+      <w:r>
+        <w:rPr>
+          <w:rFonts w:ascii="Calibri" w:hAnsi="Calibri" w:cs="Calibri" w:hint="cs"/>
+          <w:rtl/>
+          <w:lang w:val="en-US"/>
+        </w:rPr>
+        <w:t xml:space="preserve"> \  משקפי שמש+ ראיה </w:t>
+      </w:r>
+      <w:r>
+        <w:rPr>
+          <w:rFonts w:ascii="Calibri" w:hAnsi="Calibri" w:cs="Calibri"/>
+          <w:rtl/>
+          <w:lang w:val="en-US"/>
+        </w:rPr>
+        <w:t>–</w:t>
+      </w:r>
+      <w:r>
+        <w:rPr>
+          <w:rFonts w:ascii="Calibri" w:hAnsi="Calibri" w:cs="Calibri" w:hint="cs"/>
+          <w:rtl/>
+          <w:lang w:val="en-US"/>
+        </w:rPr>
+        <w:t xml:space="preserve"> </w:t>
+      </w:r>
+      <w:r>
+        <w:rPr>
+          <w:rFonts w:ascii="Calibri" w:hAnsi="Calibri" w:cs="Calibri"/>
+          <w:lang w:val="en-US"/>
+        </w:rPr>
+        <w:t xml:space="preserve">TUDI EYEWEAR </w:t>
+      </w:r>
+      <w:r>
+        <w:rPr>
+          <w:rFonts w:ascii="Calibri" w:hAnsi="Calibri" w:cs="Calibri" w:hint="cs"/>
+          <w:rtl/>
+          <w:lang w:val="en-US"/>
+        </w:rPr>
+        <w:t xml:space="preserve"> \ </w:t>
+      </w:r>
+    </w:p>
+    <w:p>
+      <w:pPr>
+        <w:bidi/>
+        <w:rPr>
+          <w:rFonts w:ascii="Calibri" w:hAnsi="Calibri" w:cs="Calibri"/>
+          <w:lang w:val="en-US"/>
+        </w:rPr>
+      </w:pPr>
+      <w:r>
+        <w:rPr>
+          <w:rFonts w:ascii="Calibri" w:hAnsi="Calibri" w:cs="Calibri" w:hint="cs"/>
+          <w:rtl/>
+        </w:rPr>
+        <w:t xml:space="preserve">בייקרי נחמד של בייגלים- </w:t>
+      </w:r>
+      <w:r>
+        <w:rPr>
+          <w:rFonts w:ascii="Calibri" w:hAnsi="Calibri" w:cs="Calibri"/>
+          <w:lang w:val="en-US"/>
+        </w:rPr>
+        <w:t>WABI's</w:t>
+      </w:r>
+    </w:p>
+    <w:p>
+      <w:pPr>
+        <w:bidi/>
+        <w:rPr>
+          <w:rFonts w:ascii="Calibri" w:hAnsi="Calibri" w:cs="Calibri"/>
+          <w:rtl/>
+        </w:rPr>
+      </w:pPr>
+      <w:r>
+        <w:rPr>
+          <w:rFonts w:ascii="Calibri" w:hAnsi="Calibri" w:cs="Calibri" w:hint="cs"/>
+          <w:rtl/>
+        </w:rPr>
+        <w:t xml:space="preserve">להמשיך לשכונת </w:t>
+      </w:r>
+      <w:r>
+        <w:rPr>
+          <w:rFonts w:ascii="Calibri" w:hAnsi="Calibri" w:cs="Calibri"/>
+        </w:rPr>
+        <w:t>TALAT NOI</w:t>
+      </w:r>
+    </w:p>
+    <w:p>
+      <w:pPr>
+        <w:bidi/>
+        <w:rPr>
+          <w:rFonts w:ascii="Calibri" w:hAnsi="Calibri" w:cs="Calibri"/>
+          <w:rtl/>
+        </w:rPr>
+      </w:pPr>
+      <w:r>
+        <w:rPr>
+          <w:rFonts w:ascii="Calibri" w:hAnsi="Calibri" w:cs="Calibri" w:hint="cs"/>
+          <w:rtl/>
+          <w:lang w:val="en-US"/>
+        </w:rPr>
+        <w:t xml:space="preserve">לקראת הערב הולכים לציינה טאון </w:t>
+      </w:r>
+      <w:r>
+        <w:rPr>
+          <w:rFonts w:ascii="Calibri" w:hAnsi="Calibri" w:cs="Calibri"/>
+        </w:rPr>
+        <w:t>Yaowarat Road</w:t>
+      </w:r>
+      <w:r>
+        <w:rPr>
+          <w:rFonts w:ascii="Calibri" w:hAnsi="Calibri" w:cs="Calibri" w:hint="cs"/>
+          <w:rtl/>
+        </w:rPr>
+        <w:t xml:space="preserve"> </w:t>
+      </w:r>
+      <w:r>
+        <w:rPr>
+          <w:rFonts w:ascii="Calibri" w:hAnsi="Calibri" w:cs="Calibri"/>
+          <w:rtl/>
+        </w:rPr>
+        <w:t>–</w:t>
+      </w:r>
+      <w:r>
+        <w:rPr>
+          <w:rFonts w:ascii="Calibri" w:hAnsi="Calibri" w:cs="Calibri" w:hint="cs"/>
+          <w:rtl/>
+        </w:rPr>
+        <w:t xml:space="preserve"> הרחוב מתחיל את שיאו משעה 18:00 </w:t>
+      </w:r>
+    </w:p>
+    <w:p>
+      <w:pPr>
+        <w:bidi/>
+        <w:rPr>
+          <w:rFonts w:ascii="Calibri" w:hAnsi="Calibri" w:cs="Calibri"/>
+          <w:rtl/>
+        </w:rPr>
+      </w:pPr>
+    </w:p>
+    <w:p>
+      <w:pPr>
+        <w:bidi/>
+        <w:rPr>
+          <w:rFonts w:ascii="Calibri" w:hAnsi="Calibri" w:cs="Calibri"/>
+          <w:b/>
+          <w:bCs/>
+          <w:rtl/>
+        </w:rPr>
+      </w:pPr>
+      <w:r>
+        <w:rPr>
+          <w:rFonts w:ascii="Calibri" w:hAnsi="Calibri" w:cs="Calibri" w:hint="cs"/>
+          <w:b/>
+          <w:bCs/>
+          <w:rtl/>
+        </w:rPr>
+        <w:t xml:space="preserve">יום 3 </w:t>
+      </w:r>
+      <w:r>
+        <w:rPr>
+          <w:rFonts w:ascii="Calibri" w:hAnsi="Calibri" w:cs="Calibri"/>
+          <w:b/>
+          <w:bCs/>
+          <w:rtl/>
+        </w:rPr>
+        <w:t>–</w:t>
+      </w:r>
+      <w:r>
+        <w:rPr>
+          <w:rFonts w:ascii="Calibri" w:hAnsi="Calibri" w:cs="Calibri" w:hint="cs"/>
+          <w:b/>
+          <w:bCs/>
+          <w:rtl/>
+        </w:rPr>
+        <w:t xml:space="preserve"> 28.9, יום שני</w:t>
+      </w:r>
+    </w:p>
+    <w:p>
+      <w:pPr>
+        <w:bidi/>
+        <w:rPr>
+          <w:rFonts w:ascii="Calibri" w:hAnsi="Calibri" w:cs="Calibri"/>
+          <w:rtl/>
+        </w:rPr>
+      </w:pPr>
+      <w:r>
+        <w:rPr>
+          <w:rFonts w:ascii="Calibri" w:hAnsi="Calibri" w:cs="Calibri" w:hint="cs"/>
+          <w:rtl/>
+        </w:rPr>
+        <w:t xml:space="preserve">קניות </w:t>
+      </w:r>
+    </w:p>
+    <w:p>
+      <w:pPr>
+        <w:bidi/>
+        <w:rPr>
+          <w:rFonts w:ascii="Calibri" w:hAnsi="Calibri" w:cs="Calibri" w:hint="cs"/>
+          <w:rtl/>
+          <w:lang w:val="en-US"/>
+        </w:rPr>
+      </w:pPr>
+      <w:r>
+        <w:rPr>
+          <w:rFonts w:ascii="Calibri" w:hAnsi="Calibri" w:cs="Calibri"/>
+        </w:rPr>
+        <w:t>Siam Center</w:t>
+      </w:r>
+      <w:r>
+        <w:rPr>
+          <w:rFonts w:ascii="Calibri" w:hAnsi="Calibri" w:cs="Calibri"/>
+          <w:lang w:val="en-US"/>
+        </w:rPr>
+        <w:t xml:space="preserve"> / MBK </w:t>
+      </w:r>
+      <w:r>
+        <w:rPr>
+          <w:rFonts w:ascii="Calibri" w:hAnsi="Calibri" w:cs="Calibri" w:hint="cs"/>
+          <w:rtl/>
+        </w:rPr>
+        <w:t xml:space="preserve"> </w:t>
+      </w:r>
+      <w:r>
+        <w:rPr>
+          <w:rFonts w:ascii="Calibri" w:hAnsi="Calibri" w:cs="Calibri"/>
+          <w:rtl/>
+        </w:rPr>
+        <w:t>–</w:t>
+      </w:r>
+      <w:r>
+        <w:rPr>
+          <w:rFonts w:ascii="Calibri" w:hAnsi="Calibri" w:cs="Calibri" w:hint="cs"/>
+          <w:rtl/>
+        </w:rPr>
+        <w:t xml:space="preserve"> קניון</w:t>
+      </w:r>
+      <w:r>
+        <w:rPr>
+          <w:rFonts w:ascii="Calibri" w:hAnsi="Calibri" w:cs="Calibri"/>
+          <w:lang w:val="en-US"/>
+        </w:rPr>
+        <w:t xml:space="preserve">   </w:t>
+      </w:r>
+    </w:p>
+    <w:p>
+      <w:pPr>
+        <w:bidi/>
+        <w:rPr>
+          <w:rFonts w:ascii="Calibri" w:hAnsi="Calibri" w:cs="Calibri"/>
+          <w:b/>
+          <w:bCs/>
+          <w:rtl/>
+          <w:lang w:val="en-US"/>
+        </w:rPr>
+      </w:pPr>
+      <w:r>
+        <w:rPr>
+          <w:rFonts w:ascii="Calibri" w:hAnsi="Calibri" w:cs="Calibri"/>
+          <w:b/>
+          <w:bCs/>
+          <w:lang w:val="en-US"/>
+        </w:rPr>
+        <w:t xml:space="preserve"> </w:t>
+      </w:r>
+      <w:r>
+        <w:rPr>
+          <w:rFonts w:ascii="Calibri" w:hAnsi="Calibri" w:cs="Calibri"/>
+          <w:b/>
+          <w:bCs/>
+          <w:lang w:val="en-US"/>
+        </w:rPr>
+        <w:t xml:space="preserve">Siam </w:t>
+      </w:r>
+      <w:proofErr w:type="gramStart"/>
+      <w:r>
+        <w:rPr>
+          <w:rFonts w:ascii="Calibri" w:hAnsi="Calibri" w:cs="Calibri"/>
+          <w:b/>
+          <w:bCs/>
+          <w:lang w:val="en-US"/>
+        </w:rPr>
+        <w:t>Square</w:t>
+      </w:r>
+      <w:r>
+        <w:rPr>
+          <w:rFonts w:ascii="Calibri" w:hAnsi="Calibri" w:cs="Calibri"/>
+          <w:b/>
+          <w:bCs/>
+          <w:lang w:val="en-US"/>
+        </w:rPr>
+        <w:t xml:space="preserve">  </w:t>
+      </w:r>
+      <w:r>
+        <w:rPr>
+          <w:rFonts w:ascii="Calibri" w:hAnsi="Calibri" w:cs="Calibri" w:hint="cs"/>
+          <w:b/>
+          <w:bCs/>
+          <w:rtl/>
+          <w:lang w:val="en-US"/>
+        </w:rPr>
+        <w:t>יוצאים</w:t>
+      </w:r>
+      <w:proofErr w:type="gramEnd"/>
+      <w:r>
+        <w:rPr>
+          <w:rFonts w:ascii="Calibri" w:hAnsi="Calibri" w:cs="Calibri" w:hint="cs"/>
+          <w:b/>
+          <w:bCs/>
+          <w:rtl/>
+          <w:lang w:val="en-US"/>
+        </w:rPr>
+        <w:t xml:space="preserve"> מהקניון וממשיכים אל כיכר סיאם </w:t>
+      </w:r>
+    </w:p>
+    <w:p>
+      <w:pPr>
+        <w:bidi/>
+        <w:rPr>
+          <w:rFonts w:ascii="Calibri" w:hAnsi="Calibri" w:cs="Calibri"/>
+          <w:lang w:val="en-US"/>
+        </w:rPr>
+      </w:pPr>
+      <w:r>
+        <w:rPr>
+          <w:rFonts w:ascii="Calibri" w:hAnsi="Calibri" w:cs="Calibri"/>
+          <w:rtl/>
+        </w:rPr>
+        <w:t>זה אזור של רחובות קטנים מול</w:t>
+      </w:r>
+      <w:r>
+        <w:rPr>
+          <w:rFonts w:ascii="Calibri" w:hAnsi="Calibri" w:cs="Calibri"/>
+          <w:lang w:val="en-US"/>
+        </w:rPr>
+        <w:t xml:space="preserve"> Siam Center </w:t>
+      </w:r>
+      <w:r>
+        <w:rPr>
+          <w:rFonts w:ascii="Calibri" w:hAnsi="Calibri" w:cs="Calibri"/>
+          <w:rtl/>
+        </w:rPr>
+        <w:t xml:space="preserve">עם </w:t>
+      </w:r>
+      <w:r>
+        <w:rPr>
+          <w:rFonts w:ascii="Calibri" w:hAnsi="Calibri" w:cs="Calibri"/>
+          <w:b/>
+          <w:bCs/>
+          <w:rtl/>
+        </w:rPr>
+        <w:t>חנויות עצמאיות, אופנה צעירה, קוסמטיקה</w:t>
+      </w:r>
+      <w:r>
+        <w:rPr>
+          <w:rFonts w:ascii="Calibri" w:hAnsi="Calibri" w:cs="Calibri"/>
+          <w:b/>
+          <w:bCs/>
+          <w:lang w:val="en-US"/>
+        </w:rPr>
+        <w:t xml:space="preserve">, accessories, </w:t>
+      </w:r>
+      <w:r>
+        <w:rPr>
+          <w:rFonts w:ascii="Calibri" w:hAnsi="Calibri" w:cs="Calibri"/>
+          <w:b/>
+          <w:bCs/>
+          <w:rtl/>
+        </w:rPr>
+        <w:t>קוריאני/יפני והמון קהל צעיר מקומי</w:t>
+      </w:r>
+      <w:r>
+        <w:rPr>
+          <w:rFonts w:ascii="Calibri" w:hAnsi="Calibri" w:cs="Calibri"/>
+          <w:b/>
+          <w:bCs/>
+          <w:lang w:val="en-US"/>
+        </w:rPr>
+        <w:t>.</w:t>
+      </w:r>
+    </w:p>
+    <w:p>
+      <w:pPr>
+        <w:bidi/>
+        <w:rPr>
+          <w:rFonts w:ascii="Calibri" w:hAnsi="Calibri" w:cs="Calibri"/>
+          <w:lang w:val="en-US"/>
+        </w:rPr>
+      </w:pPr>
+      <w:r>
+        <w:rPr>
+          <w:rFonts w:ascii="Calibri" w:hAnsi="Calibri" w:cs="Calibri" w:hint="cs"/>
+          <w:rtl/>
+          <w:lang w:val="en-US"/>
+        </w:rPr>
+        <w:t xml:space="preserve">חנות ללכת אליה&gt; </w:t>
+      </w:r>
+      <w:r>
+        <w:rPr>
+          <w:rFonts w:ascii="Calibri" w:hAnsi="Calibri" w:cs="Calibri"/>
+        </w:rPr>
+        <w:t>TRES</w:t>
+      </w:r>
+    </w:p>
+    <w:p>
+      <w:pPr>
+        <w:bidi/>
+        <w:rPr>
+          <w:rFonts w:ascii="Calibri" w:hAnsi="Calibri" w:cs="Calibri" w:hint="cs"/>
+          <w:rtl/>
+          <w:lang w:val="en-US"/>
+        </w:rPr>
+      </w:pPr>
+      <w:r>
+        <w:rPr>
+          <w:rFonts w:ascii="Calibri" w:hAnsi="Calibri" w:cs="Calibri" w:hint="cs"/>
+          <w:rtl/>
+          <w:lang w:val="en-US"/>
+        </w:rPr>
+        <w:t xml:space="preserve">ללכת לאכול </w:t>
+      </w:r>
+      <w:proofErr w:type="spellStart"/>
+      <w:r>
+        <w:rPr>
+          <w:rFonts w:ascii="Calibri" w:hAnsi="Calibri" w:cs="Calibri" w:hint="cs"/>
+          <w:rtl/>
+          <w:lang w:val="en-US"/>
+        </w:rPr>
+        <w:t>בסושירו</w:t>
+      </w:r>
+      <w:proofErr w:type="spellEnd"/>
+      <w:r>
+        <w:rPr>
+          <w:rFonts w:ascii="Calibri" w:hAnsi="Calibri" w:cs="Calibri" w:hint="cs"/>
+          <w:rtl/>
+          <w:lang w:val="en-US"/>
+        </w:rPr>
+        <w:t xml:space="preserve"> </w:t>
+      </w:r>
+      <w:proofErr w:type="spellStart"/>
+      <w:r>
+        <w:rPr>
+          <w:rFonts w:ascii="Calibri" w:hAnsi="Calibri" w:cs="Calibri" w:hint="cs"/>
+          <w:rtl/>
+          <w:lang w:val="en-US"/>
+        </w:rPr>
+        <w:t>צהריים</w:t>
+      </w:r>
+      <w:proofErr w:type="spellEnd"/>
+      <w:r>
+        <w:rPr>
+          <w:rFonts w:ascii="Calibri" w:hAnsi="Calibri" w:cs="Calibri" w:hint="cs"/>
+          <w:rtl/>
+          <w:lang w:val="en-US"/>
+        </w:rPr>
+        <w:t xml:space="preserve">. </w:t>
+      </w:r>
+    </w:p>
+    <w:p>
+      <w:pPr>
+        <w:bidi/>
+        <w:rPr>
+          <w:rFonts w:ascii="Calibri" w:hAnsi="Calibri" w:cs="Calibri" w:hint="cs"/>
+          <w:rtl/>
+          <w:lang w:val="en-US"/>
+        </w:rPr>
+      </w:pPr>
+      <w:r>
+        <w:rPr>
+          <w:rFonts w:ascii="Calibri" w:hAnsi="Calibri" w:cs="Calibri" w:hint="cs"/>
+          <w:rtl/>
+          <w:lang w:val="en-US"/>
+        </w:rPr>
+        <w:lastRenderedPageBreak/>
+        <w:t xml:space="preserve">בערב- </w:t>
+      </w:r>
+      <w:r>
+        <w:rPr>
+          <w:rFonts w:ascii="Calibri" w:hAnsi="Calibri" w:cs="Calibri"/>
+          <w:b/>
+          <w:bCs/>
+        </w:rPr>
+        <w:t>ICONSIAM</w:t>
+      </w:r>
+      <w:r>
+        <w:rPr>
+          <w:rFonts w:ascii="Calibri" w:hAnsi="Calibri" w:cs="Calibri"/>
+          <w:lang w:val="en-US"/>
+        </w:rPr>
+        <w:t xml:space="preserve"> </w:t>
+      </w:r>
+    </w:p>
+    <w:p>
+      <w:pPr>
+        <w:bidi/>
+        <w:rPr>
+          <w:rFonts w:ascii="Calibri" w:hAnsi="Calibri" w:cs="Calibri" w:hint="cs"/>
+          <w:rtl/>
+          <w:lang w:val="en-US"/>
+        </w:rPr>
+      </w:pPr>
+      <w:r>
+        <w:rPr>
+          <w:rFonts w:ascii="Calibri" w:hAnsi="Calibri" w:cs="Calibri" w:hint="cs"/>
+          <w:rtl/>
+          <w:lang w:val="en-US"/>
+        </w:rPr>
+        <w:t xml:space="preserve">שוק לילה&gt; </w:t>
+      </w:r>
+      <w:r>
+        <w:rPr>
+          <w:rFonts w:ascii="Calibri" w:hAnsi="Calibri" w:cs="Calibri"/>
+        </w:rPr>
+        <w:t>Train Night Market Srinagarindra</w:t>
+      </w:r>
+      <w:r>
+        <w:rPr>
+          <w:rFonts w:ascii="Calibri" w:hAnsi="Calibri" w:cs="Calibri" w:hint="cs"/>
+          <w:rtl/>
+          <w:lang w:val="en-US"/>
+        </w:rPr>
+        <w:t xml:space="preserve"> או </w:t>
+      </w:r>
+      <w:proofErr w:type="spellStart"/>
+      <w:r>
+        <w:rPr>
+          <w:rFonts w:ascii="Calibri" w:hAnsi="Calibri" w:cs="Calibri" w:hint="cs"/>
+          <w:rtl/>
+          <w:lang w:val="en-US"/>
+        </w:rPr>
+        <w:t>הקוואסן</w:t>
+      </w:r>
+      <w:proofErr w:type="spellEnd"/>
+      <w:r>
+        <w:rPr>
+          <w:rFonts w:ascii="Calibri" w:hAnsi="Calibri" w:cs="Calibri" w:hint="cs"/>
+          <w:rtl/>
+          <w:lang w:val="en-US"/>
+        </w:rPr>
+        <w:t xml:space="preserve">. </w:t>
+      </w:r>
+    </w:p>
+    <w:p>
+      <w:pPr>
+        <w:bidi/>
+        <w:rPr>
+          <w:rFonts w:ascii="Calibri" w:hAnsi="Calibri" w:cs="Calibri"/>
+          <w:rtl/>
+        </w:rPr>
+      </w:pPr>
+    </w:p>
+    <w:p>
+      <w:pPr>
+        <w:bidi/>
+        <w:rPr>
+          <w:rFonts w:ascii="Calibri" w:hAnsi="Calibri" w:cs="Calibri"/>
+          <w:rtl/>
+        </w:rPr>
+      </w:pPr>
+    </w:p>
+    <w:p>
+      <w:pPr>
+        <w:bidi/>
+        <w:rPr>
+          <w:rFonts w:ascii="Calibri" w:hAnsi="Calibri" w:cs="Calibri" w:hint="cs"/>
+          <w:rtl/>
+        </w:rPr>
+      </w:pPr>
+    </w:p>
+    <w:p>
+      <w:pPr>
+        <w:bidi/>
+        <w:rPr>
+          <w:rFonts w:ascii="Calibri" w:hAnsi="Calibri" w:cs="Calibri"/>
+          <w:b/>
+          <w:bCs/>
+          <w:rtl/>
+          <w:lang w:val="en-US"/>
+        </w:rPr>
+      </w:pPr>
+      <w:r>
+        <w:rPr>
+          <w:rFonts w:ascii="Calibri" w:hAnsi="Calibri" w:cs="Calibri" w:hint="cs"/>
+          <w:b/>
+          <w:bCs/>
+          <w:rtl/>
+          <w:lang w:val="en-US"/>
+        </w:rPr>
+        <w:t>יום 4</w:t>
+      </w:r>
+    </w:p>
+    <w:p>
+      <w:pPr>
+        <w:bidi/>
+        <w:rPr>
+          <w:rFonts w:ascii="Calibri" w:hAnsi="Calibri" w:cs="Calibri" w:hint="cs"/>
+          <w:rtl/>
+          <w:lang w:val="en-US"/>
+        </w:rPr>
+      </w:pPr>
+      <w:r>
+        <w:rPr>
+          <w:rFonts w:ascii="Calibri" w:hAnsi="Calibri" w:cs="Calibri" w:hint="cs"/>
+          <w:rtl/>
+          <w:lang w:val="en-US"/>
+        </w:rPr>
+        <w:t xml:space="preserve">טיסה </w:t>
+      </w:r>
+      <w:proofErr w:type="spellStart"/>
+      <w:r>
+        <w:rPr>
+          <w:rFonts w:ascii="Calibri" w:hAnsi="Calibri" w:cs="Calibri" w:hint="cs"/>
+          <w:rtl/>
+          <w:lang w:val="en-US"/>
+        </w:rPr>
+        <w:t>לקוסמוי</w:t>
+      </w:r>
+      <w:proofErr w:type="spellEnd"/>
+      <w:r>
+        <w:rPr>
+          <w:rFonts w:ascii="Calibri" w:hAnsi="Calibri" w:cs="Calibri" w:hint="cs"/>
+          <w:rtl/>
+          <w:lang w:val="en-US"/>
+        </w:rPr>
+        <w:t xml:space="preserve"> ומעבורת לקו טאו </w:t>
+      </w:r>
+    </w:p>
+    <w:p>
+      <w:pPr>
+        <w:bidi/>
+        <w:rPr>
+          <w:rFonts w:ascii="Calibri" w:hAnsi="Calibri" w:cs="Calibri"/>
+          <w:b/>
+          <w:bCs/>
+          <w:rtl/>
+        </w:rPr>
+      </w:pPr>
+    </w:p>
+    <w:p>
+      <w:pPr>
+        <w:bidi/>
+        <w:rPr>
+          <w:rFonts w:ascii="Calibri" w:hAnsi="Calibri" w:cs="Calibri"/>
+          <w:b/>
+          <w:bCs/>
+          <w:rtl/>
+        </w:rPr>
+      </w:pPr>
+      <w:r>
+        <w:rPr>
+          <w:rFonts w:ascii="Calibri" w:hAnsi="Calibri" w:cs="Calibri" w:hint="cs"/>
+          <w:b/>
+          <w:bCs/>
+          <w:rtl/>
+        </w:rPr>
+        <w:t xml:space="preserve"> </w:t>
+      </w:r>
+      <w:r>
+        <w:rPr>
+          <w:rFonts w:ascii="Calibri" w:hAnsi="Calibri" w:cs="Calibri" w:hint="cs"/>
+          <w:b/>
+          <w:bCs/>
+          <w:rtl/>
+        </w:rPr>
+        <w:t>תוכנית הונג קונג</w:t>
+      </w:r>
+    </w:p>
+    <w:p>
+      <w:pPr>
+        <w:bidi/>
+        <w:rPr>
+          <w:rFonts w:ascii="Calibri" w:hAnsi="Calibri" w:cs="Calibri"/>
+          <w:rtl/>
+          <w:lang w:val="en-US"/>
+        </w:rPr>
+      </w:pPr>
+      <w:r>
+        <w:rPr>
+          <w:rFonts w:ascii="Calibri" w:hAnsi="Calibri" w:cs="Calibri" w:hint="cs"/>
+          <w:rtl/>
+          <w:lang w:val="en-US"/>
+        </w:rPr>
+        <w:t xml:space="preserve">11.10- ערב ראשון </w:t>
+      </w:r>
+    </w:p>
+    <w:p>
+      <w:pPr>
+        <w:bidi/>
+        <w:rPr>
+          <w:rFonts w:ascii="Calibri" w:hAnsi="Calibri" w:cs="Calibri"/>
+          <w:rtl/>
+          <w:lang w:val="en-US"/>
+        </w:rPr>
+      </w:pPr>
+      <w:r>
+        <w:rPr>
+          <w:rFonts w:ascii="Calibri" w:hAnsi="Calibri" w:cs="Calibri"/>
+        </w:rPr>
+        <w:t>K11 MUSEA</w:t>
+      </w:r>
+      <w:r>
+        <w:rPr>
+          <w:rFonts w:ascii="Calibri" w:hAnsi="Calibri" w:cs="Calibri" w:hint="cs"/>
+          <w:rtl/>
+          <w:lang w:val="en-US"/>
+        </w:rPr>
+        <w:t xml:space="preserve"> </w:t>
+      </w:r>
+      <w:r>
+        <w:rPr>
+          <w:rFonts w:ascii="Calibri" w:hAnsi="Calibri" w:cs="Calibri"/>
+          <w:rtl/>
+          <w:lang w:val="en-US"/>
+        </w:rPr>
+        <w:t>–</w:t>
+      </w:r>
+      <w:r>
+        <w:rPr>
+          <w:rFonts w:ascii="Calibri" w:hAnsi="Calibri" w:cs="Calibri" w:hint="cs"/>
+          <w:rtl/>
+          <w:lang w:val="en-US"/>
+        </w:rPr>
+        <w:t xml:space="preserve"> תצפית על הנהר וכל העיר </w:t>
+      </w:r>
+    </w:p>
+    <w:p>
+      <w:pPr>
+        <w:bidi/>
+        <w:rPr>
+          <w:rFonts w:ascii="Calibri" w:hAnsi="Calibri" w:cs="Calibri"/>
+          <w:rtl/>
+        </w:rPr>
+      </w:pPr>
+      <w:r>
+        <w:rPr>
+          <w:rFonts w:ascii="Calibri" w:hAnsi="Calibri" w:cs="Calibri" w:hint="cs"/>
+          <w:rtl/>
+          <w:lang w:val="en-US"/>
+        </w:rPr>
+        <w:t xml:space="preserve">משם להמשיך ל- </w:t>
+      </w:r>
+      <w:r>
+        <w:rPr>
+          <w:rFonts w:ascii="Calibri" w:hAnsi="Calibri" w:cs="Calibri"/>
+        </w:rPr>
+        <w:t>Avenue of Stars</w:t>
+      </w:r>
+    </w:p>
+    <w:p>
+      <w:pPr>
+        <w:bidi/>
+        <w:rPr>
+          <w:rFonts w:ascii="Calibri" w:hAnsi="Calibri" w:cs="Calibri"/>
+          <w:rtl/>
+        </w:rPr>
+      </w:pPr>
+      <w:r>
+        <w:rPr>
+          <w:rFonts w:ascii="Calibri" w:hAnsi="Calibri" w:cs="Calibri"/>
+          <w:b/>
+          <w:bCs/>
+        </w:rPr>
+        <w:t>Symphony of Lights</w:t>
+      </w:r>
+      <w:r>
+        <w:rPr>
+          <w:rFonts w:ascii="Calibri" w:hAnsi="Calibri" w:cs="Calibri"/>
+        </w:rPr>
+        <w:t xml:space="preserve"> </w:t>
+      </w:r>
+      <w:r>
+        <w:rPr>
+          <w:rFonts w:ascii="Calibri" w:hAnsi="Calibri" w:cs="Calibri"/>
+        </w:rPr>
+        <w:br/>
+      </w:r>
+      <w:r>
+        <w:rPr>
+          <w:rFonts w:ascii="Calibri" w:hAnsi="Calibri" w:cs="Calibri"/>
+          <w:rtl/>
+          <w:lang w:val="en-US"/>
+        </w:rPr>
+        <w:t xml:space="preserve">המופע מתקיים נכון לעכשיו </w:t>
+      </w:r>
+      <w:r>
+        <w:rPr>
+          <w:rFonts w:ascii="Calibri" w:hAnsi="Calibri" w:cs="Calibri"/>
+          <w:b/>
+          <w:bCs/>
+          <w:rtl/>
+          <w:lang w:val="en-US"/>
+        </w:rPr>
+        <w:t>כל ערב ב־20:00</w:t>
+      </w:r>
+      <w:r>
+        <w:rPr>
+          <w:rFonts w:ascii="Calibri" w:hAnsi="Calibri" w:cs="Calibri"/>
+        </w:rPr>
+        <w:t xml:space="preserve">, </w:t>
+      </w:r>
+      <w:r>
+        <w:rPr>
+          <w:rFonts w:ascii="Calibri" w:hAnsi="Calibri" w:cs="Calibri"/>
+          <w:rtl/>
+          <w:lang w:val="en-US"/>
+        </w:rPr>
+        <w:t>ואזור</w:t>
+      </w:r>
+      <w:r>
+        <w:rPr>
+          <w:rFonts w:ascii="Calibri" w:hAnsi="Calibri" w:cs="Calibri"/>
+        </w:rPr>
+        <w:t xml:space="preserve"> Avenue of Stars </w:t>
+      </w:r>
+      <w:r>
+        <w:rPr>
+          <w:rFonts w:ascii="Calibri" w:hAnsi="Calibri" w:cs="Calibri"/>
+          <w:rtl/>
+          <w:lang w:val="en-US"/>
+        </w:rPr>
+        <w:t>הוא אחת מנקודות הצפייה הרשמיות</w:t>
+      </w:r>
+      <w:r>
+        <w:rPr>
+          <w:rFonts w:ascii="Calibri" w:hAnsi="Calibri" w:cs="Calibri"/>
+        </w:rPr>
+        <w:t>.</w:t>
+      </w:r>
+    </w:p>
+    <w:p>
+      <w:pPr>
+        <w:bidi/>
+        <w:rPr>
+          <w:rFonts w:ascii="Calibri" w:hAnsi="Calibri" w:cs="Calibri"/>
+          <w:rtl/>
+        </w:rPr>
+      </w:pPr>
+      <w:r>
+        <w:rPr>
+          <w:rFonts w:ascii="Calibri" w:hAnsi="Calibri" w:cs="Calibri" w:hint="cs"/>
+          <w:rtl/>
+        </w:rPr>
+        <w:t xml:space="preserve">ארוחת ערב&gt; </w:t>
+      </w:r>
+    </w:p>
+    <w:p>
+      <w:pPr>
+        <w:bidi/>
+        <w:rPr>
+          <w:rFonts w:ascii="Calibri" w:hAnsi="Calibri" w:cs="Calibri"/>
+          <w:rtl/>
+        </w:rPr>
+      </w:pPr>
+    </w:p>
+    <w:p>
+      <w:pPr>
+        <w:bidi/>
+        <w:rPr>
+          <w:rFonts w:ascii="Calibri" w:hAnsi="Calibri" w:cs="Calibri"/>
+          <w:rtl/>
+        </w:rPr>
+      </w:pPr>
+    </w:p>
+    <w:p>
+      <w:pPr>
+        <w:bidi/>
+        <w:rPr>
+          <w:rFonts w:ascii="Calibri" w:hAnsi="Calibri" w:cs="Calibri"/>
+          <w:rtl/>
+        </w:rPr>
+      </w:pPr>
+    </w:p>
+    <w:p>
+      <w:pPr>
+        <w:bidi/>
+        <w:rPr>
+          <w:rFonts w:ascii="Calibri" w:hAnsi="Calibri" w:cs="Calibri"/>
+          <w:rtl/>
+        </w:rPr>
+      </w:pPr>
+      <w:r>
+        <w:rPr>
+          <w:rFonts w:ascii="Calibri" w:hAnsi="Calibri" w:cs="Calibri" w:hint="cs"/>
+          <w:rtl/>
+        </w:rPr>
+        <w:lastRenderedPageBreak/>
+        <w:t xml:space="preserve">12.10 </w:t>
+      </w:r>
+    </w:p>
+    <w:p>
+      <w:pPr>
+        <w:bidi/>
+        <w:rPr>
+          <w:rFonts w:ascii="Calibri" w:hAnsi="Calibri" w:cs="Calibri"/>
+          <w:rtl/>
+        </w:rPr>
+      </w:pPr>
+      <w:r>
+        <w:rPr>
+          <w:rFonts w:ascii="Calibri" w:hAnsi="Calibri" w:cs="Calibri" w:hint="cs"/>
+          <w:rtl/>
+        </w:rPr>
+        <w:t xml:space="preserve">ארוחת בוקר </w:t>
+      </w:r>
+    </w:p>
+    <w:p>
+      <w:pPr>
+        <w:bidi/>
+        <w:rPr>
+          <w:rFonts w:ascii="Calibri" w:hAnsi="Calibri" w:cs="Calibri"/>
+          <w:rtl/>
+        </w:rPr>
+      </w:pPr>
+      <w:r>
+        <w:rPr>
+          <w:rFonts w:ascii="Calibri" w:hAnsi="Calibri" w:cs="Calibri" w:hint="cs"/>
+          <w:rtl/>
+        </w:rPr>
+        <w:t xml:space="preserve">עליה </w:t>
+      </w:r>
+      <w:proofErr w:type="spellStart"/>
+      <w:r>
+        <w:rPr>
+          <w:rFonts w:ascii="Calibri" w:hAnsi="Calibri" w:cs="Calibri" w:hint="cs"/>
+          <w:rtl/>
+        </w:rPr>
+        <w:t>לויקטוריה</w:t>
+      </w:r>
+      <w:proofErr w:type="spellEnd"/>
+      <w:r>
+        <w:rPr>
+          <w:rFonts w:ascii="Calibri" w:hAnsi="Calibri" w:cs="Calibri" w:hint="cs"/>
+          <w:rtl/>
+        </w:rPr>
+        <w:t xml:space="preserve"> פיק בטראם</w:t>
+      </w:r>
+    </w:p>
+    <w:p>
+      <w:pPr>
+        <w:bidi/>
+        <w:rPr>
+          <w:rFonts w:ascii="Calibri" w:hAnsi="Calibri" w:cs="Calibri"/>
+          <w:b/>
+          <w:bCs/>
+          <w:lang w:val="en-US"/>
+        </w:rPr>
+      </w:pPr>
+      <w:proofErr w:type="spellStart"/>
+      <w:r>
+        <w:rPr>
+          <w:rFonts w:ascii="Calibri" w:hAnsi="Calibri" w:cs="Calibri"/>
+          <w:b/>
+          <w:bCs/>
+          <w:lang w:val="en-US"/>
+        </w:rPr>
+        <w:t>PoHo</w:t>
+      </w:r>
+      <w:proofErr w:type="spellEnd"/>
+      <w:r>
+        <w:rPr>
+          <w:rFonts w:ascii="Calibri" w:hAnsi="Calibri" w:cs="Calibri"/>
+          <w:b/>
+          <w:bCs/>
+          <w:lang w:val="en-US"/>
+        </w:rPr>
+        <w:t xml:space="preserve"> / Tai Ping Shan Street</w:t>
+      </w:r>
+    </w:p>
+    <w:p>
+      <w:pPr>
+        <w:bidi/>
+        <w:rPr>
+          <w:rFonts w:ascii="Calibri" w:hAnsi="Calibri" w:cs="Calibri"/>
+          <w:rtl/>
+          <w:lang w:val="en-US"/>
+        </w:rPr>
+      </w:pPr>
+      <w:r>
+        <w:rPr>
+          <w:rFonts w:ascii="Calibri" w:hAnsi="Calibri" w:cs="Calibri"/>
+          <w:rtl/>
+        </w:rPr>
+        <w:t>זה בדיוק אחד האזורים שחיפשת: רחובות קטנים, אמנות, גלריות, בתי קפה וחנויות חדשות בתוך שכונה ותיקה. לשכת התיירות של הונג קונג מתארת את</w:t>
+      </w:r>
+      <w:r>
+        <w:rPr>
+          <w:rFonts w:ascii="Calibri" w:hAnsi="Calibri" w:cs="Calibri"/>
+          <w:lang w:val="en-US"/>
+        </w:rPr>
+        <w:t xml:space="preserve"> Tai Ping Shan </w:t>
+      </w:r>
+      <w:r>
+        <w:rPr>
+          <w:rFonts w:ascii="Calibri" w:hAnsi="Calibri" w:cs="Calibri"/>
+          <w:rtl/>
+        </w:rPr>
+        <w:t>כאזור תרבותי עם</w:t>
+      </w:r>
+      <w:r>
+        <w:rPr>
+          <w:rFonts w:ascii="Calibri" w:hAnsi="Calibri" w:cs="Calibri"/>
+          <w:lang w:val="en-US"/>
+        </w:rPr>
+        <w:t xml:space="preserve"> influx </w:t>
+      </w:r>
+      <w:r>
+        <w:rPr>
+          <w:rFonts w:ascii="Calibri" w:hAnsi="Calibri" w:cs="Calibri"/>
+          <w:rtl/>
+        </w:rPr>
+        <w:t xml:space="preserve">של </w:t>
+      </w:r>
+      <w:r>
+        <w:rPr>
+          <w:rFonts w:ascii="Calibri" w:hAnsi="Calibri" w:cs="Calibri"/>
+          <w:b/>
+          <w:bCs/>
+          <w:rtl/>
+        </w:rPr>
+        <w:t>חנויות חדשות, גלריות ובתי קפה</w:t>
+      </w:r>
+      <w:r>
+        <w:rPr>
+          <w:rFonts w:ascii="Calibri" w:hAnsi="Calibri" w:cs="Calibri"/>
+          <w:lang w:val="en-US"/>
+        </w:rPr>
+        <w:t xml:space="preserve">, </w:t>
+      </w:r>
+      <w:r>
+        <w:rPr>
+          <w:rFonts w:ascii="Calibri" w:hAnsi="Calibri" w:cs="Calibri"/>
+          <w:rtl/>
+        </w:rPr>
+        <w:t>שמושך קהל צעיר</w:t>
+      </w:r>
+      <w:r>
+        <w:rPr>
+          <w:rFonts w:ascii="Calibri" w:hAnsi="Calibri" w:cs="Calibri"/>
+          <w:lang w:val="en-US"/>
+        </w:rPr>
+        <w:t>.</w:t>
+      </w:r>
+    </w:p>
+    <w:p>
+      <w:pPr>
+        <w:bidi/>
+        <w:rPr>
+          <w:rFonts w:ascii="Calibri" w:hAnsi="Calibri" w:cs="Calibri"/>
+          <w:lang w:val="en-US"/>
+        </w:rPr>
+      </w:pPr>
+      <w:r>
+        <w:rPr>
+          <w:rFonts w:ascii="Calibri" w:hAnsi="Calibri" w:cs="Calibri" w:hint="cs"/>
+          <w:rtl/>
+          <w:lang w:val="en-US"/>
+        </w:rPr>
+        <w:t xml:space="preserve">לחזור למרכז העיר- </w:t>
+      </w:r>
+      <w:r>
+        <w:rPr>
+          <w:rFonts w:ascii="Calibri" w:hAnsi="Calibri" w:cs="Calibri"/>
+        </w:rPr>
+        <w:t>Hollywood Road + Staunton Street</w:t>
+      </w:r>
+    </w:p>
+    <w:p>
+      <w:pPr>
+        <w:bidi/>
+        <w:rPr>
+          <w:rFonts w:ascii="Calibri" w:hAnsi="Calibri" w:cs="Calibri" w:hint="cs"/>
+          <w:rtl/>
+          <w:lang w:val="en-US"/>
+        </w:rPr>
+      </w:pPr>
+      <w:r>
+        <w:rPr>
+          <w:rFonts w:ascii="Calibri" w:hAnsi="Calibri" w:cs="Calibri"/>
+        </w:rPr>
+        <w:t xml:space="preserve">Tai Ping Shan Street → Po Hing Fong → Square Street → </w:t>
+      </w:r>
+      <w:r>
+        <w:rPr>
+          <w:rFonts w:ascii="Calibri" w:hAnsi="Calibri" w:cs="Calibri"/>
+          <w:rtl/>
+          <w:lang w:val="en-US"/>
+        </w:rPr>
+        <w:t>קצת</w:t>
+      </w:r>
+      <w:r>
+        <w:rPr>
+          <w:rFonts w:ascii="Calibri" w:hAnsi="Calibri" w:cs="Calibri"/>
+        </w:rPr>
+        <w:t xml:space="preserve"> Hollywood Road.</w:t>
+      </w:r>
+    </w:p>
+    <w:p>
+      <w:pPr>
+        <w:bidi/>
+        <w:rPr>
+          <w:rFonts w:ascii="Calibri" w:hAnsi="Calibri" w:cs="Calibri"/>
+          <w:rtl/>
+          <w:lang w:val="en-US"/>
+        </w:rPr>
+      </w:pPr>
+      <w:r>
+        <w:rPr>
+          <w:rFonts w:ascii="Calibri" w:hAnsi="Calibri" w:cs="Calibri" w:hint="cs"/>
+          <w:rtl/>
+          <w:lang w:val="en-US"/>
+        </w:rPr>
+        <w:t xml:space="preserve">לקראת ערב ללכת למון קונג </w:t>
+      </w:r>
+      <w:r>
+        <w:rPr>
+          <w:rFonts w:ascii="Calibri" w:hAnsi="Calibri" w:cs="Calibri"/>
+          <w:rtl/>
+          <w:lang w:val="en-US"/>
+        </w:rPr>
+        <w:t>–</w:t>
+      </w:r>
+      <w:r>
+        <w:rPr>
+          <w:rFonts w:ascii="Calibri" w:hAnsi="Calibri" w:cs="Calibri" w:hint="cs"/>
+          <w:rtl/>
+          <w:lang w:val="en-US"/>
+        </w:rPr>
+        <w:t xml:space="preserve"> </w:t>
+      </w:r>
+      <w:proofErr w:type="spellStart"/>
+      <w:r>
+        <w:rPr>
+          <w:rFonts w:ascii="Calibri" w:hAnsi="Calibri" w:cs="Calibri" w:hint="cs"/>
+          <w:rtl/>
+          <w:lang w:val="en-US"/>
+        </w:rPr>
+        <w:t>ליידיס</w:t>
+      </w:r>
+      <w:proofErr w:type="spellEnd"/>
+      <w:r>
+        <w:rPr>
+          <w:rFonts w:ascii="Calibri" w:hAnsi="Calibri" w:cs="Calibri" w:hint="cs"/>
+          <w:rtl/>
+          <w:lang w:val="en-US"/>
+        </w:rPr>
+        <w:t xml:space="preserve"> מרקט + סניקרס </w:t>
+      </w:r>
+      <w:proofErr w:type="spellStart"/>
+      <w:r>
+        <w:rPr>
+          <w:rFonts w:ascii="Calibri" w:hAnsi="Calibri" w:cs="Calibri" w:hint="cs"/>
+          <w:rtl/>
+          <w:lang w:val="en-US"/>
+        </w:rPr>
+        <w:t>סטריט</w:t>
+      </w:r>
+      <w:proofErr w:type="spellEnd"/>
+      <w:r>
+        <w:rPr>
+          <w:rFonts w:ascii="Calibri" w:hAnsi="Calibri" w:cs="Calibri" w:hint="cs"/>
+          <w:rtl/>
+          <w:lang w:val="en-US"/>
+        </w:rPr>
+        <w:t xml:space="preserve"> </w:t>
+      </w:r>
+    </w:p>
+    <w:p>
+      <w:pPr>
+        <w:bidi/>
+        <w:rPr>
+          <w:rFonts w:ascii="Calibri" w:hAnsi="Calibri" w:cs="Calibri"/>
+          <w:rtl/>
+          <w:lang w:val="en-US"/>
+        </w:rPr>
+      </w:pPr>
+    </w:p>
+    <w:p>
+      <w:pPr>
+        <w:bidi/>
+        <w:rPr>
+          <w:rFonts w:ascii="Calibri" w:hAnsi="Calibri" w:cs="Calibri"/>
+          <w:rtl/>
+          <w:lang w:val="en-US"/>
+        </w:rPr>
+      </w:pPr>
+      <w:r>
+        <w:rPr>
+          <w:rFonts w:ascii="Calibri" w:hAnsi="Calibri" w:cs="Calibri" w:hint="cs"/>
+          <w:rtl/>
+          <w:lang w:val="en-US"/>
+        </w:rPr>
+        <w:t>13.10</w:t>
+      </w:r>
+    </w:p>
+    <w:p>
+      <w:pPr>
+        <w:bidi/>
+        <w:rPr>
+          <w:rFonts w:ascii="Calibri" w:hAnsi="Calibri" w:cs="Calibri"/>
+          <w:b/>
+          <w:bCs/>
+          <w:rtl/>
+          <w:lang w:val="en-US"/>
+        </w:rPr>
+      </w:pPr>
+      <w:r>
+        <w:rPr>
+          <w:rFonts w:ascii="Calibri" w:hAnsi="Calibri" w:cs="Calibri" w:hint="cs"/>
+          <w:b/>
+          <w:bCs/>
+          <w:rtl/>
+          <w:lang w:val="en-US"/>
+        </w:rPr>
+        <w:t xml:space="preserve">מקאו </w:t>
+      </w:r>
+    </w:p>
+    <w:p>
+      <w:pPr>
+        <w:bidi/>
+        <w:rPr>
+          <w:rFonts w:ascii="Calibri" w:hAnsi="Calibri" w:cs="Calibri"/>
+          <w:rtl/>
+          <w:lang w:val="en-US"/>
+        </w:rPr>
+      </w:pPr>
+      <w:r>
+        <w:rPr>
+          <w:rFonts w:ascii="Calibri" w:hAnsi="Calibri" w:cs="Calibri" w:hint="cs"/>
+          <w:rtl/>
+          <w:lang w:val="en-US"/>
+        </w:rPr>
+        <w:t>לא לשכוח להביא דרכון!</w:t>
+      </w:r>
+    </w:p>
+    <w:p>
+      <w:pPr>
+        <w:bidi/>
+        <w:rPr>
+          <w:rFonts w:ascii="Calibri" w:hAnsi="Calibri" w:cs="Calibri"/>
+          <w:rtl/>
+          <w:lang w:val="en-US"/>
+        </w:rPr>
+      </w:pPr>
+      <w:r>
+        <w:rPr>
+          <w:rFonts w:ascii="Calibri" w:hAnsi="Calibri" w:cs="Calibri" w:hint="cs"/>
+          <w:rtl/>
+          <w:lang w:val="en-US"/>
+        </w:rPr>
+        <w:t>מעבורת ל</w:t>
+      </w:r>
+      <w:proofErr w:type="spellStart"/>
+      <w:r>
+        <w:rPr>
+          <w:rFonts w:ascii="Calibri" w:hAnsi="Calibri" w:cs="Calibri"/>
+          <w:lang w:val="en-US"/>
+        </w:rPr>
+        <w:t>taipa</w:t>
+      </w:r>
+      <w:proofErr w:type="spellEnd"/>
+      <w:r>
+        <w:rPr>
+          <w:rFonts w:ascii="Calibri" w:hAnsi="Calibri" w:cs="Calibri"/>
+          <w:lang w:val="en-US"/>
+        </w:rPr>
+        <w:t xml:space="preserve">  TERMINAL </w:t>
+      </w:r>
+    </w:p>
+    <w:p>
+      <w:pPr>
+        <w:bidi/>
+        <w:rPr>
+          <w:rFonts w:ascii="Calibri" w:hAnsi="Calibri" w:cs="Calibri"/>
+          <w:rtl/>
+          <w:lang w:val="en-US"/>
+        </w:rPr>
+      </w:pPr>
+      <w:r>
+        <w:rPr>
+          <w:rFonts w:ascii="Calibri" w:hAnsi="Calibri" w:cs="Calibri"/>
+          <w:b/>
+          <w:bCs/>
+        </w:rPr>
+        <w:t>Taipa Village</w:t>
+      </w:r>
+      <w:r>
+        <w:rPr>
+          <w:rFonts w:ascii="Calibri" w:hAnsi="Calibri" w:cs="Calibri"/>
+        </w:rPr>
+        <w:t>.</w:t>
+      </w:r>
+      <w:r>
+        <w:rPr>
+          <w:rFonts w:ascii="Calibri" w:hAnsi="Calibri" w:cs="Calibri" w:hint="cs"/>
+          <w:rtl/>
+          <w:lang w:val="en-US"/>
+        </w:rPr>
+        <w:t xml:space="preserve"> </w:t>
+      </w:r>
+    </w:p>
+    <w:p>
+      <w:pPr>
+        <w:bidi/>
+        <w:rPr>
+          <w:rFonts w:ascii="Calibri" w:hAnsi="Calibri" w:cs="Calibri"/>
+          <w:rtl/>
+          <w:lang w:val="en-US"/>
+        </w:rPr>
+      </w:pPr>
+      <w:r>
+        <w:rPr>
+          <w:rFonts w:ascii="Calibri" w:hAnsi="Calibri" w:cs="Calibri"/>
+        </w:rPr>
+        <w:t>Rua do Cunha</w:t>
+      </w:r>
+      <w:r>
+        <w:rPr>
+          <w:rFonts w:ascii="Calibri" w:hAnsi="Calibri" w:cs="Calibri" w:hint="cs"/>
+          <w:rtl/>
+          <w:lang w:val="en-US"/>
+        </w:rPr>
+        <w:t xml:space="preserve"> </w:t>
+      </w:r>
+      <w:r>
+        <w:rPr>
+          <w:rFonts w:ascii="Calibri" w:hAnsi="Calibri" w:cs="Calibri"/>
+          <w:rtl/>
+          <w:lang w:val="en-US"/>
+        </w:rPr>
+        <w:t>–</w:t>
+      </w:r>
+      <w:r>
+        <w:rPr>
+          <w:rFonts w:ascii="Calibri" w:hAnsi="Calibri" w:cs="Calibri" w:hint="cs"/>
+          <w:rtl/>
+          <w:lang w:val="en-US"/>
+        </w:rPr>
+        <w:t xml:space="preserve"> רחוב חמוד צבעוני </w:t>
+      </w:r>
+    </w:p>
+    <w:p>
+      <w:pPr>
+        <w:bidi/>
+        <w:rPr>
+          <w:rFonts w:ascii="Calibri" w:hAnsi="Calibri" w:cs="Calibri"/>
+          <w:lang w:val="en-US"/>
+        </w:rPr>
+      </w:pPr>
+      <w:r>
+        <w:rPr>
+          <w:rFonts w:ascii="Calibri" w:hAnsi="Calibri" w:cs="Calibri"/>
+          <w:rtl/>
+          <w:lang w:val="en-US"/>
+        </w:rPr>
+        <w:t xml:space="preserve">אפשר ללכת לכיוון </w:t>
+      </w:r>
+      <w:r>
+        <w:rPr>
+          <w:rFonts w:ascii="Calibri" w:hAnsi="Calibri" w:cs="Calibri"/>
+          <w:b/>
+          <w:bCs/>
+        </w:rPr>
+        <w:t>Taipa Houses</w:t>
+      </w:r>
+      <w:r>
+        <w:rPr>
+          <w:rFonts w:ascii="Calibri" w:hAnsi="Calibri" w:cs="Calibri"/>
+        </w:rPr>
+        <w:t xml:space="preserve"> — </w:t>
+      </w:r>
+      <w:r>
+        <w:rPr>
+          <w:rFonts w:ascii="Calibri" w:hAnsi="Calibri" w:cs="Calibri"/>
+          <w:rtl/>
+          <w:lang w:val="en-US"/>
+        </w:rPr>
+        <w:t xml:space="preserve">בתי אחוזה קולוניאליים בצבע </w:t>
+      </w:r>
+      <w:proofErr w:type="spellStart"/>
+      <w:r>
+        <w:rPr>
+          <w:rFonts w:ascii="Calibri" w:hAnsi="Calibri" w:cs="Calibri"/>
+          <w:rtl/>
+          <w:lang w:val="en-US"/>
+        </w:rPr>
+        <w:t>ירוק־מנטה</w:t>
+      </w:r>
+      <w:proofErr w:type="spellEnd"/>
+      <w:r>
+        <w:rPr>
+          <w:rFonts w:ascii="Calibri" w:hAnsi="Calibri" w:cs="Calibri"/>
+          <w:rtl/>
+          <w:lang w:val="en-US"/>
+        </w:rPr>
+        <w:t xml:space="preserve"> ליד המים</w:t>
+      </w:r>
+    </w:p>
+    <w:p>
+      <w:pPr>
+        <w:bidi/>
+        <w:rPr>
+          <w:rFonts w:ascii="Calibri" w:hAnsi="Calibri" w:cs="Calibri"/>
+          <w:b/>
+          <w:bCs/>
+          <w:rtl/>
+          <w:lang w:val="en-US"/>
+        </w:rPr>
+      </w:pPr>
+      <w:r>
+        <w:rPr>
+          <w:rFonts w:ascii="Calibri" w:hAnsi="Calibri" w:cs="Calibri"/>
+          <w:b/>
+          <w:bCs/>
+        </w:rPr>
+        <w:t>COTAI</w:t>
+      </w:r>
+      <w:r>
+        <w:rPr>
+          <w:rFonts w:ascii="Calibri" w:hAnsi="Calibri" w:cs="Calibri" w:hint="cs"/>
+          <w:b/>
+          <w:bCs/>
+          <w:rtl/>
+          <w:lang w:val="en-US"/>
+        </w:rPr>
+        <w:t xml:space="preserve">- מקאו החדשה </w:t>
+      </w:r>
+      <w:r>
+        <w:rPr>
+          <w:rFonts w:ascii="Calibri" w:hAnsi="Calibri" w:cs="Calibri" w:hint="cs"/>
+          <w:b/>
+          <w:bCs/>
+          <w:rtl/>
+          <w:lang w:val="en-US"/>
+        </w:rPr>
+        <w:t xml:space="preserve">- </w:t>
+      </w:r>
+      <w:r>
+        <w:rPr>
+          <w:rFonts w:ascii="Calibri" w:hAnsi="Calibri" w:cs="Calibri" w:hint="cs"/>
+          <w:b/>
+          <w:bCs/>
+          <w:rtl/>
+          <w:lang w:val="en-US"/>
+        </w:rPr>
+        <w:t xml:space="preserve">סיבוב בין המלונות והמתחמים הגדולים </w:t>
+      </w:r>
+    </w:p>
+    <w:p>
+      <w:pPr>
+        <w:bidi/>
+        <w:rPr>
+          <w:rFonts w:ascii="Calibri" w:hAnsi="Calibri" w:cs="Calibri" w:hint="cs"/>
+          <w:b/>
+          <w:bCs/>
+          <w:lang w:val="en-US"/>
+        </w:rPr>
+      </w:pPr>
+      <w:r>
+        <w:rPr>
+          <w:rFonts w:ascii="Calibri" w:hAnsi="Calibri" w:cs="Calibri"/>
+          <w:b/>
+          <w:bCs/>
+        </w:rPr>
+        <w:lastRenderedPageBreak/>
+        <w:t>Studio City</w:t>
+      </w:r>
+      <w:r>
+        <w:rPr>
+          <w:rFonts w:ascii="Calibri" w:hAnsi="Calibri" w:cs="Calibri" w:hint="cs"/>
+          <w:b/>
+          <w:bCs/>
+          <w:rtl/>
+          <w:lang w:val="en-US"/>
+        </w:rPr>
+        <w:t xml:space="preserve"> </w:t>
+      </w:r>
+      <w:r>
+        <w:rPr>
+          <w:rFonts w:ascii="Calibri" w:hAnsi="Calibri" w:cs="Calibri"/>
+          <w:b/>
+          <w:bCs/>
+          <w:rtl/>
+          <w:lang w:val="en-US"/>
+        </w:rPr>
+        <w:t>–</w:t>
+      </w:r>
+      <w:r>
+        <w:rPr>
+          <w:rFonts w:ascii="Calibri" w:hAnsi="Calibri" w:cs="Calibri" w:hint="cs"/>
+          <w:b/>
+          <w:bCs/>
+          <w:rtl/>
+          <w:lang w:val="en-US"/>
+        </w:rPr>
+        <w:t xml:space="preserve"> איפה שהגלגל הענק </w:t>
+      </w:r>
+    </w:p>
+    <w:p>
+      <w:pPr>
+        <w:bidi/>
+        <w:rPr>
+          <w:rFonts w:ascii="Calibri" w:hAnsi="Calibri" w:cs="Calibri" w:hint="cs"/>
+          <w:rtl/>
+          <w:lang w:val="en-US"/>
+        </w:rPr>
+      </w:pPr>
+      <w:r>
+        <w:rPr>
+          <w:rFonts w:ascii="Calibri" w:hAnsi="Calibri" w:cs="Calibri"/>
+        </w:rPr>
+        <w:t>.</w:t>
+      </w:r>
+      <w:r>
+        <w:rPr>
+          <w:rFonts w:ascii="Calibri" w:hAnsi="Calibri" w:cs="Calibri" w:hint="cs"/>
+          <w:rtl/>
+          <w:lang w:val="en-US"/>
+        </w:rPr>
+        <w:t xml:space="preserve">ממשיכים למקאו העתיקה&gt; </w:t>
+      </w:r>
+      <w:r>
+        <w:rPr>
+          <w:rFonts w:ascii="Calibri" w:hAnsi="Calibri" w:cs="Calibri"/>
+          <w:b/>
+          <w:bCs/>
+        </w:rPr>
+        <w:t>Senado Square</w:t>
+      </w:r>
+      <w:r>
+        <w:rPr>
+          <w:rFonts w:ascii="Calibri" w:hAnsi="Calibri" w:cs="Calibri"/>
+        </w:rPr>
+        <w:t xml:space="preserve"> </w:t>
+      </w:r>
+      <w:r>
+        <w:rPr>
+          <w:rFonts w:ascii="Calibri" w:hAnsi="Calibri" w:cs="Calibri" w:hint="cs"/>
+          <w:rtl/>
+          <w:lang w:val="en-US"/>
+        </w:rPr>
+        <w:t xml:space="preserve"> </w:t>
+      </w:r>
+      <w:r>
+        <w:rPr>
+          <w:rFonts w:ascii="Calibri" w:hAnsi="Calibri" w:cs="Calibri"/>
+          <w:rtl/>
+          <w:lang w:val="en-US"/>
+        </w:rPr>
+        <w:t xml:space="preserve">הוא הלב של מקאו הישנה — רצפה </w:t>
+      </w:r>
+      <w:proofErr w:type="spellStart"/>
+      <w:r>
+        <w:rPr>
+          <w:rFonts w:ascii="Calibri" w:hAnsi="Calibri" w:cs="Calibri"/>
+          <w:rtl/>
+          <w:lang w:val="en-US"/>
+        </w:rPr>
+        <w:t>שחור־לבן</w:t>
+      </w:r>
+      <w:proofErr w:type="spellEnd"/>
+      <w:r>
+        <w:rPr>
+          <w:rFonts w:ascii="Calibri" w:hAnsi="Calibri" w:cs="Calibri"/>
+          <w:rtl/>
+          <w:lang w:val="en-US"/>
+        </w:rPr>
+        <w:t xml:space="preserve"> בגלים, בניינים בצבעי פסטל ואדריכלות פורטוגזית</w:t>
+      </w:r>
+      <w:r>
+        <w:rPr>
+          <w:rFonts w:ascii="Calibri" w:hAnsi="Calibri" w:cs="Calibri"/>
+        </w:rPr>
+        <w:t>.</w:t>
+      </w:r>
+    </w:p>
+    <w:p>
+      <w:pPr>
+        <w:bidi/>
+        <w:rPr>
+          <w:rFonts w:ascii="Calibri" w:hAnsi="Calibri" w:cs="Calibri"/>
+          <w:rtl/>
+          <w:lang w:val="en-US"/>
+        </w:rPr>
+      </w:pPr>
+      <w:r>
+        <w:rPr>
+          <w:rFonts w:ascii="Calibri" w:hAnsi="Calibri" w:cs="Calibri"/>
+        </w:rPr>
+        <w:t>Travessa da Paixão</w:t>
+      </w:r>
+      <w:r>
+        <w:rPr>
+          <w:rFonts w:ascii="Calibri" w:hAnsi="Calibri" w:cs="Calibri" w:hint="cs"/>
+          <w:rtl/>
+          <w:lang w:val="en-US"/>
+        </w:rPr>
+        <w:t xml:space="preserve"> </w:t>
+      </w:r>
+      <w:r>
+        <w:rPr>
+          <w:rFonts w:ascii="Calibri" w:hAnsi="Calibri" w:cs="Calibri"/>
+          <w:rtl/>
+          <w:lang w:val="en-US"/>
+        </w:rPr>
+        <w:t>–</w:t>
+      </w:r>
+      <w:r>
+        <w:rPr>
+          <w:rFonts w:ascii="Calibri" w:hAnsi="Calibri" w:cs="Calibri" w:hint="cs"/>
+          <w:rtl/>
+          <w:lang w:val="en-US"/>
+        </w:rPr>
+        <w:t xml:space="preserve"> רחוב צבעוני חמוד עם בתים ורודים. </w:t>
+      </w:r>
+    </w:p>
+    <w:p>
+      <w:pPr>
+        <w:bidi/>
+        <w:rPr>
+          <w:rFonts w:ascii="Calibri" w:hAnsi="Calibri" w:cs="Calibri"/>
+          <w:rtl/>
+          <w:lang w:val="en-US"/>
+        </w:rPr>
+      </w:pPr>
+      <w:r>
+        <w:rPr>
+          <w:rFonts w:ascii="Calibri" w:hAnsi="Calibri" w:cs="Calibri" w:hint="cs"/>
+          <w:rtl/>
+          <w:lang w:val="en-US"/>
+        </w:rPr>
+        <w:t xml:space="preserve">מעבורת חזרה להונג קונג </w:t>
+      </w:r>
+    </w:p>
+    <w:p>
+      <w:pPr>
+        <w:bidi/>
+        <w:rPr>
+          <w:rFonts w:ascii="Calibri" w:hAnsi="Calibri" w:cs="Calibri"/>
+          <w:rtl/>
+          <w:lang w:val="en-US"/>
+        </w:rPr>
+      </w:pPr>
+    </w:p>
+    <w:p>
+      <w:pPr>
+        <w:bidi/>
+        <w:rPr>
+          <w:rFonts w:ascii="Calibri" w:hAnsi="Calibri" w:cs="Calibri"/>
+          <w:rtl/>
+          <w:lang w:val="en-US"/>
+        </w:rPr>
+      </w:pPr>
+    </w:p>
+    <w:p>
+      <w:pPr>
+        <w:bidi/>
+        <w:rPr>
+          <w:rFonts w:ascii="Calibri" w:hAnsi="Calibri" w:cs="Calibri" w:hint="cs"/>
+          <w:rtl/>
+          <w:lang w:val="en-US"/>
+        </w:rPr>
+      </w:pPr>
+    </w:p>
+    <w:p>
+      <w:pPr>
+        <w:bidi/>
+        <w:rPr>
+          <w:rFonts w:ascii="Calibri" w:hAnsi="Calibri" w:cs="Calibri"/>
+          <w:rtl/>
+          <w:lang w:val="en-US"/>
+        </w:rPr>
+      </w:pPr>
+      <w:r>
+        <w:rPr>
+          <w:rFonts w:ascii="Calibri" w:hAnsi="Calibri" w:cs="Calibri" w:hint="cs"/>
+          <w:rtl/>
+          <w:lang w:val="en-US"/>
+        </w:rPr>
+        <w:t xml:space="preserve">14.10 </w:t>
+      </w:r>
+    </w:p>
+    <w:p>
+      <w:pPr>
+        <w:bidi/>
+        <w:rPr>
+          <w:rFonts w:ascii="Calibri" w:hAnsi="Calibri" w:cs="Calibri"/>
+          <w:b/>
+          <w:bCs/>
+          <w:lang w:val="en-US"/>
+        </w:rPr>
+      </w:pPr>
+      <w:r>
+        <w:rPr>
+          <w:rFonts w:ascii="Calibri" w:hAnsi="Calibri" w:cs="Calibri"/>
+          <w:b/>
+          <w:bCs/>
+          <w:rtl/>
+          <w:lang w:val="en-US"/>
+        </w:rPr>
+        <w:t>מה זה בעצם</w:t>
+      </w:r>
+      <w:r>
+        <w:rPr>
+          <w:rFonts w:ascii="Calibri" w:hAnsi="Calibri" w:cs="Calibri"/>
+          <w:b/>
+          <w:bCs/>
+          <w:lang w:val="en-US"/>
+        </w:rPr>
+        <w:t xml:space="preserve"> Sham Shui Po?</w:t>
+      </w:r>
+    </w:p>
+    <w:p>
+      <w:pPr>
+        <w:bidi/>
+        <w:rPr>
+          <w:rFonts w:ascii="Calibri" w:hAnsi="Calibri" w:cs="Calibri"/>
+          <w:lang w:val="en-US"/>
+        </w:rPr>
+      </w:pPr>
+      <w:r>
+        <w:rPr>
+          <w:rFonts w:ascii="Calibri" w:hAnsi="Calibri" w:cs="Calibri"/>
+          <w:rtl/>
+          <w:lang w:val="en-US"/>
+        </w:rPr>
+        <w:t xml:space="preserve">זו אחת השכונות הוותיקות והצפופות </w:t>
+      </w:r>
+      <w:proofErr w:type="spellStart"/>
+      <w:r>
+        <w:rPr>
+          <w:rFonts w:ascii="Calibri" w:hAnsi="Calibri" w:cs="Calibri"/>
+          <w:rtl/>
+          <w:lang w:val="en-US"/>
+        </w:rPr>
+        <w:t>בקאולון</w:t>
+      </w:r>
+      <w:proofErr w:type="spellEnd"/>
+      <w:r>
+        <w:rPr>
+          <w:rFonts w:ascii="Calibri" w:hAnsi="Calibri" w:cs="Calibri"/>
+          <w:rtl/>
+          <w:lang w:val="en-US"/>
+        </w:rPr>
+        <w:t xml:space="preserve">, היסטורית מרכז ענק של </w:t>
+      </w:r>
+      <w:r>
+        <w:rPr>
+          <w:rFonts w:ascii="Calibri" w:hAnsi="Calibri" w:cs="Calibri"/>
+          <w:b/>
+          <w:bCs/>
+          <w:rtl/>
+          <w:lang w:val="en-US"/>
+        </w:rPr>
+        <w:t>טקסטיל, תפירה, עור, אלקטרוניקה ומלאכות יד</w:t>
+      </w:r>
+      <w:r>
+        <w:rPr>
+          <w:rFonts w:ascii="Calibri" w:hAnsi="Calibri" w:cs="Calibri"/>
+          <w:lang w:val="en-US"/>
+        </w:rPr>
+        <w:t xml:space="preserve">. </w:t>
+      </w:r>
+      <w:r>
+        <w:rPr>
+          <w:rFonts w:ascii="Calibri" w:hAnsi="Calibri" w:cs="Calibri"/>
+          <w:rtl/>
+          <w:lang w:val="en-US"/>
+        </w:rPr>
+        <w:t xml:space="preserve">בשנים האחרונות נכנסה לשם שכבה צעירה ויצירתית של בתי קפה, </w:t>
+      </w:r>
+      <w:proofErr w:type="spellStart"/>
+      <w:r>
+        <w:rPr>
+          <w:rFonts w:ascii="Calibri" w:hAnsi="Calibri" w:cs="Calibri"/>
+          <w:rtl/>
+          <w:lang w:val="en-US"/>
+        </w:rPr>
+        <w:t>סטודיואים</w:t>
+      </w:r>
+      <w:proofErr w:type="spellEnd"/>
+      <w:r>
+        <w:rPr>
+          <w:rFonts w:ascii="Calibri" w:hAnsi="Calibri" w:cs="Calibri"/>
+          <w:rtl/>
+          <w:lang w:val="en-US"/>
+        </w:rPr>
+        <w:t>, חללי אמנות ומעצבים — בלי שהעסקים הישנים נעלמו. לשכת התיירות של הונג קונג מתארת אותה כיום כשילוב של שווקים ותיקים, חנויות עצמאיות, קפה</w:t>
+      </w:r>
+      <w:r>
+        <w:rPr>
+          <w:rFonts w:ascii="Calibri" w:hAnsi="Calibri" w:cs="Calibri"/>
+          <w:lang w:val="en-US"/>
+        </w:rPr>
+        <w:t xml:space="preserve"> quirky </w:t>
+      </w:r>
+      <w:r>
+        <w:rPr>
+          <w:rFonts w:ascii="Calibri" w:hAnsi="Calibri" w:cs="Calibri"/>
+          <w:rtl/>
+          <w:lang w:val="en-US"/>
+        </w:rPr>
+        <w:t>ואמנות עכשווית</w:t>
+      </w:r>
+      <w:r>
+        <w:rPr>
+          <w:rFonts w:ascii="Calibri" w:hAnsi="Calibri" w:cs="Calibri"/>
+          <w:lang w:val="en-US"/>
+        </w:rPr>
+        <w:t xml:space="preserve">. </w:t>
+      </w:r>
+    </w:p>
+    <w:p>
+      <w:pPr>
+        <w:bidi/>
+        <w:rPr>
+          <w:rFonts w:ascii="Calibri" w:hAnsi="Calibri" w:cs="Calibri"/>
+          <w:rtl/>
+          <w:lang w:val="en-US"/>
+        </w:rPr>
+      </w:pPr>
+      <w:r>
+        <w:rPr>
+          <w:rFonts w:ascii="Calibri" w:hAnsi="Calibri" w:cs="Calibri"/>
+        </w:rPr>
+        <w:t>Tai Nan Street</w:t>
+      </w:r>
+    </w:p>
+    <w:p>
+      <w:pPr>
+        <w:bidi/>
+        <w:rPr>
+          <w:rFonts w:ascii="Calibri" w:hAnsi="Calibri" w:cs="Calibri"/>
+          <w:rtl/>
+          <w:lang w:val="en-US"/>
+        </w:rPr>
+      </w:pPr>
+      <w:r>
+        <w:rPr>
+          <w:rFonts w:ascii="Calibri" w:hAnsi="Calibri" w:cs="Calibri"/>
+        </w:rPr>
+        <w:t>DX design hub</w:t>
+      </w:r>
+    </w:p>
+    <w:p>
+      <w:pPr>
+        <w:bidi/>
+        <w:rPr>
+          <w:rFonts w:ascii="Calibri" w:hAnsi="Calibri" w:cs="Calibri"/>
+          <w:lang w:val="en-US"/>
+        </w:rPr>
+      </w:pPr>
+      <w:hyperlink r:id="rId16" w:history="1">
+        <w:r>
+          <w:rPr>
+            <w:rStyle w:val="Hyperlink"/>
+            <w:rFonts w:ascii="Calibri" w:hAnsi="Calibri" w:cs="Calibri"/>
+          </w:rPr>
+          <w:t>Harbour City</w:t>
+        </w:r>
+      </w:hyperlink>
+      <w:r>
+        <w:rPr>
+          <w:rFonts w:ascii="Calibri" w:hAnsi="Calibri" w:cs="Calibri" w:hint="cs"/>
+          <w:rtl/>
+          <w:lang w:val="en-US"/>
+        </w:rPr>
+        <w:t xml:space="preserve">- קניון </w:t>
+      </w:r>
+    </w:p>
+    <w:p>
+      <w:pPr>
+        <w:bidi/>
+        <w:rPr>
+          <w:rFonts w:ascii="Calibri" w:hAnsi="Calibri" w:cs="Calibri"/>
+          <w:rtl/>
+          <w:lang w:val="en-US"/>
+        </w:rPr>
+      </w:pPr>
+      <w:proofErr w:type="spellStart"/>
+      <w:r>
+        <w:rPr>
+          <w:rFonts w:ascii="Calibri" w:hAnsi="Calibri" w:cs="Calibri" w:hint="cs"/>
+          <w:rtl/>
+          <w:lang w:val="en-US"/>
+        </w:rPr>
+        <w:t>ראמן</w:t>
+      </w:r>
+      <w:proofErr w:type="spellEnd"/>
+      <w:r>
+        <w:rPr>
+          <w:rFonts w:ascii="Calibri" w:hAnsi="Calibri" w:cs="Calibri" w:hint="cs"/>
+          <w:rtl/>
+          <w:lang w:val="en-US"/>
+        </w:rPr>
+        <w:t xml:space="preserve">&gt; </w:t>
+      </w:r>
+      <w:proofErr w:type="spellStart"/>
+      <w:r>
+        <w:rPr>
+          <w:rFonts w:ascii="Calibri" w:hAnsi="Calibri" w:cs="Calibri"/>
+          <w:lang w:val="en-US"/>
+        </w:rPr>
+        <w:t>Shugetsu</w:t>
+      </w:r>
+      <w:proofErr w:type="spellEnd"/>
+    </w:p>
+    <w:p>
+      <w:pPr>
+        <w:bidi/>
+        <w:rPr>
+          <w:rFonts w:ascii="Calibri" w:hAnsi="Calibri" w:cs="Calibri" w:hint="cs"/>
+          <w:rtl/>
+          <w:lang w:val="en-US"/>
+        </w:rPr>
+      </w:pPr>
+    </w:p>
+    <w:p>
+      <w:pPr>
+        <w:bidi/>
+        <w:rPr>
+          <w:rFonts w:ascii="Calibri" w:hAnsi="Calibri" w:cs="Calibri"/>
+          <w:rtl/>
+          <w:lang w:val="en-US"/>
+        </w:rPr>
+      </w:pPr>
+      <w:r>
+        <w:rPr>
+          <w:rFonts w:ascii="Calibri" w:hAnsi="Calibri" w:cs="Calibri" w:hint="cs"/>
+          <w:rtl/>
+          <w:lang w:val="en-US"/>
+        </w:rPr>
+        <w:t xml:space="preserve">15.10 </w:t>
+      </w:r>
+    </w:p>
+    <w:p>
+      <w:pPr>
+        <w:bidi/>
+        <w:rPr>
+          <w:rFonts w:ascii="Calibri" w:hAnsi="Calibri" w:cs="Calibri"/>
+          <w:rtl/>
+          <w:lang w:val="en-US"/>
+        </w:rPr>
+      </w:pPr>
+      <w:r>
+        <w:rPr>
+          <w:rFonts w:ascii="Calibri" w:hAnsi="Calibri" w:cs="Calibri" w:hint="cs"/>
+          <w:rtl/>
+          <w:lang w:val="en-US"/>
+        </w:rPr>
+        <w:t xml:space="preserve">דיסני </w:t>
+      </w:r>
+    </w:p>
+    <w:p>
+      <w:pPr>
+        <w:bidi/>
+        <w:rPr>
+          <w:rFonts w:ascii="Calibri" w:hAnsi="Calibri" w:cs="Calibri"/>
+          <w:rtl/>
+          <w:lang w:val="en-US"/>
+        </w:rPr>
+      </w:pPr>
+    </w:p>
+    <w:p>
+      <w:pPr>
+        <w:bidi/>
+        <w:rPr>
+          <w:rFonts w:ascii="Calibri" w:hAnsi="Calibri" w:cs="Calibri"/>
+          <w:rtl/>
+          <w:lang w:val="en-US"/>
+        </w:rPr>
+      </w:pPr>
+    </w:p>
+    <w:p>
+      <w:pPr>
+        <w:bidi/>
+        <w:rPr>
+          <w:rFonts w:ascii="Calibri" w:hAnsi="Calibri" w:cs="Calibri"/>
+          <w:rtl/>
+          <w:lang w:val="en-US"/>
+        </w:rPr>
+      </w:pPr>
+    </w:p>
+    <w:p>
+      <w:pPr>
+        <w:bidi/>
+        <w:rPr>
+          <w:rFonts w:ascii="Calibri" w:hAnsi="Calibri" w:cs="Calibri"/>
+          <w:rtl/>
+          <w:lang w:val="en-US"/>
+        </w:rPr>
+      </w:pPr>
+    </w:p>
+    <w:p>
+      <w:pPr>
+        <w:bidi/>
+        <w:rPr>
+          <w:rFonts w:ascii="Calibri" w:hAnsi="Calibri" w:cs="Calibri"/>
+          <w:rtl/>
+          <w:lang w:val="en-US"/>
+        </w:rPr>
+      </w:pPr>
+    </w:p>
+    <w:p>
+      <w:pPr>
+        <w:bidi/>
+        <w:rPr>
+          <w:rFonts w:ascii="Calibri" w:hAnsi="Calibri" w:cs="Calibri"/>
+          <w:rtl/>
+          <w:lang w:val="en-US"/>
+        </w:rPr>
+      </w:pPr>
+    </w:p>
+    <w:p>
+      <w:pPr>
+        <w:bidi/>
+        <w:rPr>
+          <w:rFonts w:ascii="Calibri" w:hAnsi="Calibri" w:cs="Calibri"/>
+          <w:rtl/>
+          <w:lang w:val="en-US"/>
+        </w:rPr>
+      </w:pPr>
+    </w:p>
+    <w:p>
+      <w:pPr>
+        <w:bidi/>
+        <w:rPr>
+          <w:rFonts w:ascii="Calibri" w:hAnsi="Calibri" w:cs="Calibri"/>
+          <w:rtl/>
+          <w:lang w:val="en-US"/>
+        </w:rPr>
+      </w:pPr>
+    </w:p>
+    <w:p>
+      <w:pPr>
+        <w:bidi/>
+        <w:rPr>
+          <w:rFonts w:ascii="Calibri" w:hAnsi="Calibri" w:cs="Calibri"/>
+          <w:rtl/>
+          <w:lang w:val="en-US"/>
+        </w:rPr>
+      </w:pPr>
+    </w:p>
+    <w:p>
+      <w:pPr>
+        <w:bidi/>
+        <w:rPr>
+          <w:rFonts w:ascii="Calibri" w:hAnsi="Calibri" w:cs="Calibri"/>
+          <w:rtl/>
+          <w:lang w:val="en-US"/>
+        </w:rPr>
+      </w:pPr>
+    </w:p>
+    <w:p>
+      <w:pPr>
+        <w:bidi/>
+        <w:rPr>
+          <w:rFonts w:ascii="Calibri" w:hAnsi="Calibri" w:cs="Calibri"/>
+          <w:rtl/>
+          <w:lang w:val="en-US"/>
+        </w:rPr>
+      </w:pPr>
+      <w:r>
+        <w:rPr>
+          <w:rFonts w:ascii="Calibri" w:hAnsi="Calibri" w:cs="Calibri" w:hint="cs"/>
+          <w:rtl/>
+          <w:lang w:val="en-US"/>
+        </w:rPr>
+        <w:t xml:space="preserve"> </w:t>
+      </w:r>
+    </w:p>
+    <w:p>
+      <w:pPr>
+        <w:bidi/>
+        <w:rPr>
+          <w:rFonts w:ascii="Calibri" w:hAnsi="Calibri" w:cs="Calibri"/>
+          <w:rtl/>
+          <w:lang w:val="en-US"/>
+        </w:rPr>
+      </w:pPr>
+    </w:p>
+    <w:p>
+      <w:pPr>
+        <w:bidi/>
+        <w:rPr>
+          <w:rFonts w:ascii="Calibri" w:hAnsi="Calibri" w:cs="Calibri" w:hint="cs"/>
+          <w:rtl/>
+          <w:lang w:val="en-US"/>
         </w:rPr>
       </w:pPr>
     </w:p>
@@ -3405,7 +5812,7 @@
         <w:kern w:val="2"/>
         <w:sz w:val="24"/>
         <w:szCs w:val="24"/>
-        <w:lang w:val="en-IL" w:eastAsia="en-US" w:bidi="he-IL"/>
+        <w:lang w:eastAsia="en-US" w:bidi="he-IL"/>
         <w14:ligatures w14:val="standardContextual"/>
       </w:rPr>
     </w:rPrDefault>
@@ -3793,16 +6200,16 @@
     <w:lsdException w:name="Unresolved Mention" w:semiHidden="1" w:unhideWhenUsed="1"/>
     <w:lsdException w:name="Smart Link" w:semiHidden="1" w:unhideWhenUsed="1"/>
   </w:latentStyles>
-  <w:style w:type="paragraph" w:default="1" w:styleId="Normal">
+  <w:style w:type="paragraph" w:default="1" w:styleId="a">
     <w:name w:val="Normal"/>
     <w:qFormat/>
     <w:rsid w:val="00CD5705"/>
   </w:style>
-  <w:style w:type="paragraph" w:styleId="Heading1">
+  <w:style w:type="paragraph" w:styleId="1">
     <w:name w:val="heading 1"/>
-    <w:basedOn w:val="Normal"/>
-    <w:next w:val="Normal"/>
-    <w:link w:val="Heading1Char"/>
+    <w:basedOn w:val="a"/>
+    <w:next w:val="a"/>
+    <w:link w:val="10"/>
     <w:uiPriority w:val="9"/>
     <w:qFormat/>
     <w:rsid w:val="00BA146C"/>
@@ -3819,11 +6226,11 @@
       <w:szCs w:val="40"/>
     </w:rPr>
   </w:style>
-  <w:style w:type="paragraph" w:styleId="Heading2">
+  <w:style w:type="paragraph" w:styleId="2">
     <w:name w:val="heading 2"/>
-    <w:basedOn w:val="Normal"/>
-    <w:next w:val="Normal"/>
-    <w:link w:val="Heading2Char"/>
+    <w:basedOn w:val="a"/>
+    <w:next w:val="a"/>
+    <w:link w:val="20"/>
     <w:uiPriority w:val="9"/>
     <w:semiHidden/>
     <w:unhideWhenUsed/>
@@ -3842,11 +6249,11 @@
       <w:szCs w:val="32"/>
     </w:rPr>
   </w:style>
-  <w:style w:type="paragraph" w:styleId="Heading3">
+  <w:style w:type="paragraph" w:styleId="3">
     <w:name w:val="heading 3"/>
-    <w:basedOn w:val="Normal"/>
-    <w:next w:val="Normal"/>
-    <w:link w:val="Heading3Char"/>
+    <w:basedOn w:val="a"/>
+    <w:next w:val="a"/>
+    <w:link w:val="30"/>
     <w:uiPriority w:val="9"/>
     <w:unhideWhenUsed/>
     <w:qFormat/>
@@ -3864,11 +6271,11 @@
       <w:szCs w:val="28"/>
     </w:rPr>
   </w:style>
-  <w:style w:type="paragraph" w:styleId="Heading4">
+  <w:style w:type="paragraph" w:styleId="4">
     <w:name w:val="heading 4"/>
-    <w:basedOn w:val="Normal"/>
-    <w:next w:val="Normal"/>
-    <w:link w:val="Heading4Char"/>
+    <w:basedOn w:val="a"/>
+    <w:next w:val="a"/>
+    <w:link w:val="40"/>
     <w:uiPriority w:val="9"/>
     <w:semiHidden/>
     <w:unhideWhenUsed/>
@@ -3887,11 +6294,11 @@
       <w:color w:val="0F4761" w:themeColor="accent1" w:themeShade="BF"/>
     </w:rPr>
   </w:style>
-  <w:style w:type="paragraph" w:styleId="Heading5">
+  <w:style w:type="paragraph" w:styleId="5">
     <w:name w:val="heading 5"/>
-    <w:basedOn w:val="Normal"/>
-    <w:next w:val="Normal"/>
-    <w:link w:val="Heading5Char"/>
+    <w:basedOn w:val="a"/>
+    <w:next w:val="a"/>
+    <w:link w:val="50"/>
     <w:uiPriority w:val="9"/>
     <w:semiHidden/>
     <w:unhideWhenUsed/>
@@ -3908,11 +6315,11 @@
       <w:color w:val="0F4761" w:themeColor="accent1" w:themeShade="BF"/>
     </w:rPr>
   </w:style>
-  <w:style w:type="paragraph" w:styleId="Heading6">
+  <w:style w:type="paragraph" w:styleId="6">
     <w:name w:val="heading 6"/>
-    <w:basedOn w:val="Normal"/>
-    <w:next w:val="Normal"/>
-    <w:link w:val="Heading6Char"/>
+    <w:basedOn w:val="a"/>
+    <w:next w:val="a"/>
+    <w:link w:val="60"/>
     <w:uiPriority w:val="9"/>
     <w:semiHidden/>
     <w:unhideWhenUsed/>
@@ -3931,11 +6338,11 @@
       <w:color w:val="595959" w:themeColor="text1" w:themeTint="A6"/>
     </w:rPr>
   </w:style>
-  <w:style w:type="paragraph" w:styleId="Heading7">
+  <w:style w:type="paragraph" w:styleId="7">
     <w:name w:val="heading 7"/>
-    <w:basedOn w:val="Normal"/>
-    <w:next w:val="Normal"/>
-    <w:link w:val="Heading7Char"/>
+    <w:basedOn w:val="a"/>
+    <w:next w:val="a"/>
+    <w:link w:val="70"/>
     <w:uiPriority w:val="9"/>
     <w:semiHidden/>
     <w:unhideWhenUsed/>
@@ -3952,11 +6359,11 @@
       <w:color w:val="595959" w:themeColor="text1" w:themeTint="A6"/>
     </w:rPr>
   </w:style>
-  <w:style w:type="paragraph" w:styleId="Heading8">
+  <w:style w:type="paragraph" w:styleId="8">
     <w:name w:val="heading 8"/>
-    <w:basedOn w:val="Normal"/>
-    <w:next w:val="Normal"/>
-    <w:link w:val="Heading8Char"/>
+    <w:basedOn w:val="a"/>
+    <w:next w:val="a"/>
+    <w:link w:val="80"/>
     <w:uiPriority w:val="9"/>
     <w:semiHidden/>
     <w:unhideWhenUsed/>
@@ -3975,11 +6382,11 @@
       <w:color w:val="272727" w:themeColor="text1" w:themeTint="D8"/>
     </w:rPr>
   </w:style>
-  <w:style w:type="paragraph" w:styleId="Heading9">
+  <w:style w:type="paragraph" w:styleId="9">
     <w:name w:val="heading 9"/>
-    <w:basedOn w:val="Normal"/>
-    <w:next w:val="Normal"/>
-    <w:link w:val="Heading9Char"/>
+    <w:basedOn w:val="a"/>
+    <w:next w:val="a"/>
+    <w:link w:val="90"/>
     <w:uiPriority w:val="9"/>
     <w:semiHidden/>
     <w:unhideWhenUsed/>
@@ -3996,12 +6403,12 @@
       <w:color w:val="272727" w:themeColor="text1" w:themeTint="D8"/>
     </w:rPr>
   </w:style>
-  <w:style w:type="character" w:default="1" w:styleId="DefaultParagraphFont">
+  <w:style w:type="character" w:default="1" w:styleId="a0">
     <w:name w:val="Default Paragraph Font"/>
     <w:uiPriority w:val="1"/>
     <w:unhideWhenUsed/>
   </w:style>
-  <w:style w:type="table" w:default="1" w:styleId="TableNormal">
+  <w:style w:type="table" w:default="1" w:styleId="a1">
     <w:name w:val="Normal Table"/>
     <w:uiPriority w:val="99"/>
     <w:semiHidden/>
@@ -4016,16 +6423,16 @@
       </w:tblCellMar>
     </w:tblPr>
   </w:style>
-  <w:style w:type="numbering" w:default="1" w:styleId="NoList">
+  <w:style w:type="numbering" w:default="1" w:styleId="a2">
     <w:name w:val="No List"/>
     <w:uiPriority w:val="99"/>
     <w:semiHidden/>
     <w:unhideWhenUsed/>
   </w:style>
-  <w:style w:type="character" w:customStyle="1" w:styleId="Heading1Char">
-    <w:name w:val="Heading 1 Char"/>
-    <w:basedOn w:val="DefaultParagraphFont"/>
-    <w:link w:val="Heading1"/>
+  <w:style w:type="character" w:customStyle="1" w:styleId="10">
+    <w:name w:val="כותרת 1 תו"/>
+    <w:basedOn w:val="a0"/>
+    <w:link w:val="1"/>
     <w:uiPriority w:val="9"/>
     <w:rsid w:val="00BA146C"/>
     <w:rPr>
@@ -4035,10 +6442,10 @@
       <w:szCs w:val="40"/>
     </w:rPr>
   </w:style>
-  <w:style w:type="character" w:customStyle="1" w:styleId="Heading2Char">
-    <w:name w:val="Heading 2 Char"/>
-    <w:basedOn w:val="DefaultParagraphFont"/>
-    <w:link w:val="Heading2"/>
+  <w:style w:type="character" w:customStyle="1" w:styleId="20">
+    <w:name w:val="כותרת 2 תו"/>
+    <w:basedOn w:val="a0"/>
+    <w:link w:val="2"/>
     <w:uiPriority w:val="9"/>
     <w:semiHidden/>
     <w:rsid w:val="00BA146C"/>
@@ -4049,10 +6456,10 @@
       <w:szCs w:val="32"/>
     </w:rPr>
   </w:style>
-  <w:style w:type="character" w:customStyle="1" w:styleId="Heading3Char">
-    <w:name w:val="Heading 3 Char"/>
-    <w:basedOn w:val="DefaultParagraphFont"/>
-    <w:link w:val="Heading3"/>
+  <w:style w:type="character" w:customStyle="1" w:styleId="30">
+    <w:name w:val="כותרת 3 תו"/>
+    <w:basedOn w:val="a0"/>
+    <w:link w:val="3"/>
     <w:uiPriority w:val="9"/>
     <w:rsid w:val="00BA146C"/>
     <w:rPr>
@@ -4062,10 +6469,10 @@
       <w:szCs w:val="28"/>
     </w:rPr>
   </w:style>
-  <w:style w:type="character" w:customStyle="1" w:styleId="Heading4Char">
-    <w:name w:val="Heading 4 Char"/>
-    <w:basedOn w:val="DefaultParagraphFont"/>
-    <w:link w:val="Heading4"/>
+  <w:style w:type="character" w:customStyle="1" w:styleId="40">
+    <w:name w:val="כותרת 4 תו"/>
+    <w:basedOn w:val="a0"/>
+    <w:link w:val="4"/>
     <w:uiPriority w:val="9"/>
     <w:semiHidden/>
     <w:rsid w:val="00BA146C"/>
@@ -4076,10 +6483,10 @@
       <w:color w:val="0F4761" w:themeColor="accent1" w:themeShade="BF"/>
     </w:rPr>
   </w:style>
-  <w:style w:type="character" w:customStyle="1" w:styleId="Heading5Char">
-    <w:name w:val="Heading 5 Char"/>
-    <w:basedOn w:val="DefaultParagraphFont"/>
-    <w:link w:val="Heading5"/>
+  <w:style w:type="character" w:customStyle="1" w:styleId="50">
+    <w:name w:val="כותרת 5 תו"/>
+    <w:basedOn w:val="a0"/>
+    <w:link w:val="5"/>
     <w:uiPriority w:val="9"/>
     <w:semiHidden/>
     <w:rsid w:val="00BA146C"/>
@@ -4088,10 +6495,10 @@
       <w:color w:val="0F4761" w:themeColor="accent1" w:themeShade="BF"/>
     </w:rPr>
   </w:style>
-  <w:style w:type="character" w:customStyle="1" w:styleId="Heading6Char">
-    <w:name w:val="Heading 6 Char"/>
-    <w:basedOn w:val="DefaultParagraphFont"/>
-    <w:link w:val="Heading6"/>
+  <w:style w:type="character" w:customStyle="1" w:styleId="60">
+    <w:name w:val="כותרת 6 תו"/>
+    <w:basedOn w:val="a0"/>
+    <w:link w:val="6"/>
     <w:uiPriority w:val="9"/>
     <w:semiHidden/>
     <w:rsid w:val="00BA146C"/>
@@ -4102,10 +6509,10 @@
       <w:color w:val="595959" w:themeColor="text1" w:themeTint="A6"/>
     </w:rPr>
   </w:style>
-  <w:style w:type="character" w:customStyle="1" w:styleId="Heading7Char">
-    <w:name w:val="Heading 7 Char"/>
-    <w:basedOn w:val="DefaultParagraphFont"/>
-    <w:link w:val="Heading7"/>
+  <w:style w:type="character" w:customStyle="1" w:styleId="70">
+    <w:name w:val="כותרת 7 תו"/>
+    <w:basedOn w:val="a0"/>
+    <w:link w:val="7"/>
     <w:uiPriority w:val="9"/>
     <w:semiHidden/>
     <w:rsid w:val="00BA146C"/>
@@ -4114,10 +6521,10 @@
       <w:color w:val="595959" w:themeColor="text1" w:themeTint="A6"/>
     </w:rPr>
   </w:style>
-  <w:style w:type="character" w:customStyle="1" w:styleId="Heading8Char">
-    <w:name w:val="Heading 8 Char"/>
-    <w:basedOn w:val="DefaultParagraphFont"/>
-    <w:link w:val="Heading8"/>
+  <w:style w:type="character" w:customStyle="1" w:styleId="80">
+    <w:name w:val="כותרת 8 תו"/>
+    <w:basedOn w:val="a0"/>
+    <w:link w:val="8"/>
     <w:uiPriority w:val="9"/>
     <w:semiHidden/>
     <w:rsid w:val="00BA146C"/>
@@ -4128,10 +6535,10 @@
       <w:color w:val="272727" w:themeColor="text1" w:themeTint="D8"/>
     </w:rPr>
   </w:style>
-  <w:style w:type="character" w:customStyle="1" w:styleId="Heading9Char">
-    <w:name w:val="Heading 9 Char"/>
-    <w:basedOn w:val="DefaultParagraphFont"/>
-    <w:link w:val="Heading9"/>
+  <w:style w:type="character" w:customStyle="1" w:styleId="90">
+    <w:name w:val="כותרת 9 תו"/>
+    <w:basedOn w:val="a0"/>
+    <w:link w:val="9"/>
     <w:uiPriority w:val="9"/>
     <w:semiHidden/>
     <w:rsid w:val="00BA146C"/>
@@ -4140,11 +6547,11 @@
       <w:color w:val="272727" w:themeColor="text1" w:themeTint="D8"/>
     </w:rPr>
   </w:style>
-  <w:style w:type="paragraph" w:styleId="Title">
+  <w:style w:type="paragraph" w:styleId="a3">
     <w:name w:val="Title"/>
-    <w:basedOn w:val="Normal"/>
-    <w:next w:val="Normal"/>
-    <w:link w:val="TitleChar"/>
+    <w:basedOn w:val="a"/>
+    <w:next w:val="a"/>
+    <w:link w:val="a4"/>
     <w:uiPriority w:val="10"/>
     <w:qFormat/>
     <w:rsid w:val="00BA146C"/>
@@ -4160,10 +6567,10 @@
       <w:szCs w:val="56"/>
     </w:rPr>
   </w:style>
-  <w:style w:type="character" w:customStyle="1" w:styleId="TitleChar">
-    <w:name w:val="Title Char"/>
-    <w:basedOn w:val="DefaultParagraphFont"/>
-    <w:link w:val="Title"/>
+  <w:style w:type="character" w:customStyle="1" w:styleId="a4">
+    <w:name w:val="כותרת טקסט תו"/>
+    <w:basedOn w:val="a0"/>
+    <w:link w:val="a3"/>
     <w:uiPriority w:val="10"/>
     <w:rsid w:val="00BA146C"/>
     <w:rPr>
@@ -4174,11 +6581,11 @@
       <w:szCs w:val="56"/>
     </w:rPr>
   </w:style>
-  <w:style w:type="paragraph" w:styleId="Subtitle">
+  <w:style w:type="paragraph" w:styleId="a5">
     <w:name w:val="Subtitle"/>
-    <w:basedOn w:val="Normal"/>
-    <w:next w:val="Normal"/>
-    <w:link w:val="SubtitleChar"/>
+    <w:basedOn w:val="a"/>
+    <w:next w:val="a"/>
+    <w:link w:val="a6"/>
     <w:uiPriority w:val="11"/>
     <w:qFormat/>
     <w:rsid w:val="00BA146C"/>
@@ -4195,10 +6602,10 @@
       <w:szCs w:val="28"/>
     </w:rPr>
   </w:style>
-  <w:style w:type="character" w:customStyle="1" w:styleId="SubtitleChar">
-    <w:name w:val="Subtitle Char"/>
-    <w:basedOn w:val="DefaultParagraphFont"/>
-    <w:link w:val="Subtitle"/>
+  <w:style w:type="character" w:customStyle="1" w:styleId="a6">
+    <w:name w:val="כותרת משנה תו"/>
+    <w:basedOn w:val="a0"/>
+    <w:link w:val="a5"/>
     <w:uiPriority w:val="11"/>
     <w:rsid w:val="00BA146C"/>
     <w:rPr>
@@ -4209,11 +6616,11 @@
       <w:szCs w:val="28"/>
     </w:rPr>
   </w:style>
-  <w:style w:type="paragraph" w:styleId="Quote">
+  <w:style w:type="paragraph" w:styleId="a7">
     <w:name w:val="Quote"/>
-    <w:basedOn w:val="Normal"/>
-    <w:next w:val="Normal"/>
-    <w:link w:val="QuoteChar"/>
+    <w:basedOn w:val="a"/>
+    <w:next w:val="a"/>
+    <w:link w:val="a8"/>
     <w:uiPriority w:val="29"/>
     <w:qFormat/>
     <w:rsid w:val="00BA146C"/>
@@ -4227,10 +6634,10 @@
       <w:color w:val="404040" w:themeColor="text1" w:themeTint="BF"/>
     </w:rPr>
   </w:style>
-  <w:style w:type="character" w:customStyle="1" w:styleId="QuoteChar">
-    <w:name w:val="Quote Char"/>
-    <w:basedOn w:val="DefaultParagraphFont"/>
-    <w:link w:val="Quote"/>
+  <w:style w:type="character" w:customStyle="1" w:styleId="a8">
+    <w:name w:val="ציטוט תו"/>
+    <w:basedOn w:val="a0"/>
+    <w:link w:val="a7"/>
     <w:uiPriority w:val="29"/>
     <w:rsid w:val="00BA146C"/>
     <w:rPr>
@@ -4239,9 +6646,9 @@
       <w:color w:val="404040" w:themeColor="text1" w:themeTint="BF"/>
     </w:rPr>
   </w:style>
-  <w:style w:type="paragraph" w:styleId="ListParagraph">
+  <w:style w:type="paragraph" w:styleId="a9">
     <w:name w:val="List Paragraph"/>
-    <w:basedOn w:val="Normal"/>
+    <w:basedOn w:val="a"/>
     <w:uiPriority w:val="34"/>
     <w:qFormat/>
     <w:rsid w:val="00BA146C"/>
@@ -4250,9 +6657,9 @@
       <w:contextualSpacing/>
     </w:pPr>
   </w:style>
-  <w:style w:type="character" w:styleId="IntenseEmphasis">
+  <w:style w:type="character" w:styleId="aa">
     <w:name w:val="Intense Emphasis"/>
-    <w:basedOn w:val="DefaultParagraphFont"/>
+    <w:basedOn w:val="a0"/>
     <w:uiPriority w:val="21"/>
     <w:qFormat/>
     <w:rsid w:val="00BA146C"/>
@@ -4262,11 +6669,11 @@
       <w:color w:val="0F4761" w:themeColor="accent1" w:themeShade="BF"/>
     </w:rPr>
   </w:style>
-  <w:style w:type="paragraph" w:styleId="IntenseQuote">
+  <w:style w:type="paragraph" w:styleId="ab">
     <w:name w:val="Intense Quote"/>
-    <w:basedOn w:val="Normal"/>
-    <w:next w:val="Normal"/>
-    <w:link w:val="IntenseQuoteChar"/>
+    <w:basedOn w:val="a"/>
+    <w:next w:val="a"/>
+    <w:link w:val="ac"/>
     <w:uiPriority w:val="30"/>
     <w:qFormat/>
     <w:rsid w:val="00BA146C"/>
@@ -4285,10 +6692,10 @@
       <w:color w:val="0F4761" w:themeColor="accent1" w:themeShade="BF"/>
     </w:rPr>
   </w:style>
-  <w:style w:type="character" w:customStyle="1" w:styleId="IntenseQuoteChar">
-    <w:name w:val="Intense Quote Char"/>
-    <w:basedOn w:val="DefaultParagraphFont"/>
-    <w:link w:val="IntenseQuote"/>
+  <w:style w:type="character" w:customStyle="1" w:styleId="ac">
+    <w:name w:val="ציטוט חזק תו"/>
+    <w:basedOn w:val="a0"/>
+    <w:link w:val="ab"/>
     <w:uiPriority w:val="30"/>
     <w:rsid w:val="00BA146C"/>
     <w:rPr>
@@ -4297,9 +6704,9 @@
       <w:color w:val="0F4761" w:themeColor="accent1" w:themeShade="BF"/>
     </w:rPr>
   </w:style>
-  <w:style w:type="character" w:styleId="IntenseReference">
+  <w:style w:type="character" w:styleId="ad">
     <w:name w:val="Intense Reference"/>
-    <w:basedOn w:val="DefaultParagraphFont"/>
+    <w:basedOn w:val="a0"/>
     <w:uiPriority w:val="32"/>
     <w:qFormat/>
     <w:rsid w:val="00BA146C"/>
@@ -4311,9 +6718,9 @@
       <w:spacing w:val="5"/>
     </w:rPr>
   </w:style>
-  <w:style w:type="table" w:styleId="TableGrid">
+  <w:style w:type="table" w:styleId="ae">
     <w:name w:val="Table Grid"/>
-    <w:basedOn w:val="TableNormal"/>
+    <w:basedOn w:val="a1"/>
     <w:uiPriority w:val="39"/>
     <w:rsid w:val="00E10AE1"/>
     <w:pPr>
@@ -4332,7 +6739,7 @@
   </w:style>
   <w:style w:type="paragraph" w:styleId="NormalWeb">
     <w:name w:val="Normal (Web)"/>
-    <w:basedOn w:val="Normal"/>
+    <w:basedOn w:val="a"/>
     <w:uiPriority w:val="99"/>
     <w:semiHidden/>
     <w:unhideWhenUsed/>
@@ -4343,7 +6750,7 @@
   </w:style>
   <w:style w:type="character" w:styleId="Hyperlink">
     <w:name w:val="Hyperlink"/>
-    <w:basedOn w:val="DefaultParagraphFont"/>
+    <w:basedOn w:val="a0"/>
     <w:uiPriority w:val="99"/>
     <w:unhideWhenUsed/>
     <w:rsid w:val="006B7644"/>
@@ -4352,9 +6759,9 @@
       <w:u w:val="single"/>
     </w:rPr>
   </w:style>
-  <w:style w:type="character" w:styleId="UnresolvedMention">
+  <w:style w:type="character" w:styleId="af">
     <w:name w:val="Unresolved Mention"/>
-    <w:basedOn w:val="DefaultParagraphFont"/>
+    <w:basedOn w:val="a0"/>
     <w:uiPriority w:val="99"/>
     <w:semiHidden/>
     <w:unhideWhenUsed/>
@@ -4366,7 +6773,7 @@
   </w:style>
   <w:style w:type="character" w:styleId="FollowedHyperlink">
     <w:name w:val="FollowedHyperlink"/>
-    <w:basedOn w:val="DefaultParagraphFont"/>
+    <w:basedOn w:val="a0"/>
     <w:uiPriority w:val="99"/>
     <w:semiHidden/>
     <w:unhideWhenUsed/>
@@ -4376,10 +6783,10 @@
       <w:u w:val="single"/>
     </w:rPr>
   </w:style>
-  <w:style w:type="paragraph" w:styleId="Header">
+  <w:style w:type="paragraph" w:styleId="af0">
     <w:name w:val="header"/>
-    <w:basedOn w:val="Normal"/>
-    <w:link w:val="HeaderChar"/>
+    <w:basedOn w:val="a"/>
+    <w:link w:val="af1"/>
     <w:uiPriority w:val="99"/>
     <w:unhideWhenUsed/>
     <w:rsid w:val="00CD5705"/>
@@ -4391,17 +6798,17 @@
       <w:spacing w:after="0" w:line="240" w:lineRule="auto"/>
     </w:pPr>
   </w:style>
-  <w:style w:type="character" w:customStyle="1" w:styleId="HeaderChar">
-    <w:name w:val="Header Char"/>
-    <w:basedOn w:val="DefaultParagraphFont"/>
-    <w:link w:val="Header"/>
+  <w:style w:type="character" w:customStyle="1" w:styleId="af1">
+    <w:name w:val="כותרת עליונה תו"/>
+    <w:basedOn w:val="a0"/>
+    <w:link w:val="af0"/>
     <w:uiPriority w:val="99"/>
     <w:rsid w:val="00CD5705"/>
   </w:style>
-  <w:style w:type="paragraph" w:styleId="Footer">
+  <w:style w:type="paragraph" w:styleId="af2">
     <w:name w:val="footer"/>
-    <w:basedOn w:val="Normal"/>
-    <w:link w:val="FooterChar"/>
+    <w:basedOn w:val="a"/>
+    <w:link w:val="af3"/>
     <w:uiPriority w:val="99"/>
     <w:unhideWhenUsed/>
     <w:rsid w:val="00CD5705"/>
@@ -4413,10 +6820,10 @@
       <w:spacing w:after="0" w:line="240" w:lineRule="auto"/>
     </w:pPr>
   </w:style>
-  <w:style w:type="character" w:customStyle="1" w:styleId="FooterChar">
-    <w:name w:val="Footer Char"/>
-    <w:basedOn w:val="DefaultParagraphFont"/>
-    <w:link w:val="Footer"/>
+  <w:style w:type="character" w:customStyle="1" w:styleId="af3">
+    <w:name w:val="כותרת תחתונה תו"/>
+    <w:basedOn w:val="a0"/>
+    <w:link w:val="af2"/>
     <w:uiPriority w:val="99"/>
     <w:rsid w:val="00CD5705"/>
   </w:style>

</xml_diff>